<commit_message>
docs(actividad-03): corregir caratula UPDS Santa Cruz, docente Ing. Requena, integrantes Jhoel y Emmanuel, e integrar matriz de auditoria de IA completa
</commit_message>
<xml_diff>
--- a/Docs/Informe_Actividad03_Album_UML.docx
+++ b/Docs/Informe_Actividad03_Album_UML.docx
@@ -4,7 +4,7 @@
   <w:body>
     <w:p>
       <w:pPr>
-        <w:spacing w:line="360" w:lineRule="auto" w:after="80" w:before="720"/>
+        <w:spacing w:line="360" w:lineRule="auto" w:after="80" w:before="480"/>
         <w:jc w:val="center"/>
       </w:pPr>
       <w:r>
@@ -34,7 +34,7 @@
     </w:p>
     <w:p>
       <w:pPr>
-        <w:spacing w:line="360" w:lineRule="auto" w:after="720" w:before="0"/>
+        <w:spacing w:line="360" w:lineRule="auto" w:after="80" w:before="0"/>
         <w:jc w:val="center"/>
       </w:pPr>
       <w:r>
@@ -44,12 +44,12 @@
           <w:i w:val="0"/>
           <w:sz w:val="24"/>
         </w:rPr>
-        <w:t>CARRERA DE INGENIERÍA DE SISTEMAS</w:t>
+        <w:t>CARRERA DE INGENIERÍA EN SISTEMAS</w:t>
       </w:r>
     </w:p>
     <w:p>
       <w:pPr>
-        <w:spacing w:line="360" w:lineRule="auto" w:after="240" w:before="0"/>
+        <w:spacing w:line="360" w:lineRule="auto" w:after="560" w:before="0"/>
         <w:jc w:val="center"/>
       </w:pPr>
       <w:r>
@@ -64,7 +64,7 @@
     </w:p>
     <w:p>
       <w:pPr>
-        <w:spacing w:line="360" w:lineRule="auto" w:after="160" w:before="0"/>
+        <w:spacing w:line="360" w:lineRule="auto" w:after="120" w:before="0"/>
         <w:jc w:val="center"/>
       </w:pPr>
       <w:r>
@@ -74,12 +74,12 @@
           <w:i w:val="0"/>
           <w:sz w:val="24"/>
         </w:rPr>
-        <w:t>ACTIVIDAD 03 — ÁLBUM DE MODELOS UML (ENTREGABLE GRUPAL)</w:t>
+        <w:t>ACTIVIDAD 03 — ÁLBUM DE MODELOS UML</w:t>
       </w:r>
     </w:p>
     <w:p>
       <w:pPr>
-        <w:spacing w:line="360" w:lineRule="auto" w:after="480" w:before="0"/>
+        <w:spacing w:line="360" w:lineRule="auto" w:after="360" w:before="0"/>
         <w:jc w:val="center"/>
       </w:pPr>
       <w:r>
@@ -109,7 +109,7 @@
     </w:p>
     <w:p>
       <w:pPr>
-        <w:spacing w:line="360" w:lineRule="auto" w:after="960" w:before="0"/>
+        <w:spacing w:line="360" w:lineRule="auto" w:after="800" w:before="0"/>
         <w:jc w:val="center"/>
       </w:pPr>
       <w:r>
@@ -119,7 +119,52 @@
           <w:i w:val="0"/>
           <w:sz w:val="24"/>
         </w:rPr>
-        <w:t>MAPA INTEGRAL DE MODELOS ARQUITECTÓNICOS, ESTRUCTURALES (UML), ENTIDAD-RELACIÓN (ERD) Y DE COMPORTAMIENTO</w:t>
+        <w:t>MAPA INTEGRAL DE ARQUITECTURA, CLASES ESTRUCTURALES, PERSISTENCIA MULTIBASE DE DATOS (INDEXEDDB Y CLOUD FIRESTORE), CASOS DE USO Y COMPORTAMIENTO</w:t>
+      </w:r>
+    </w:p>
+    <w:p>
+      <w:pPr>
+        <w:spacing w:line="360" w:lineRule="auto" w:after="120" w:before="0"/>
+        <w:jc w:val="center"/>
+      </w:pPr>
+      <w:r>
+        <w:rPr>
+          <w:rFonts w:ascii="Times New Roman" w:hAnsi="Times New Roman"/>
+          <w:b/>
+          <w:i w:val="0"/>
+          <w:sz w:val="24"/>
+        </w:rPr>
+        <w:t>NOMBRE DE LOS ESTUDIANTES</w:t>
+      </w:r>
+    </w:p>
+    <w:p>
+      <w:pPr>
+        <w:spacing w:line="360" w:lineRule="auto" w:after="80" w:before="0"/>
+        <w:jc w:val="center"/>
+      </w:pPr>
+      <w:r>
+        <w:rPr>
+          <w:rFonts w:ascii="Times New Roman" w:hAnsi="Times New Roman"/>
+          <w:b w:val="0"/>
+          <w:i w:val="0"/>
+          <w:sz w:val="24"/>
+        </w:rPr>
+        <w:t>Jhoel Alvaro Cruz Zurita</w:t>
+      </w:r>
+    </w:p>
+    <w:p>
+      <w:pPr>
+        <w:spacing w:line="360" w:lineRule="auto" w:after="720" w:before="0"/>
+        <w:jc w:val="center"/>
+      </w:pPr>
+      <w:r>
+        <w:rPr>
+          <w:rFonts w:ascii="Times New Roman" w:hAnsi="Times New Roman"/>
+          <w:b w:val="0"/>
+          <w:i w:val="0"/>
+          <w:sz w:val="24"/>
+        </w:rPr>
+        <w:t>Emmanuel Ponce Quiroga</w:t>
       </w:r>
     </w:p>
     <w:p>
@@ -134,37 +179,7 @@
           <w:i w:val="0"/>
           <w:sz w:val="24"/>
         </w:rPr>
-        <w:t>EQUIPO DE DESARROLLO (AUTORES):</w:t>
-      </w:r>
-    </w:p>
-    <w:p>
-      <w:pPr>
-        <w:spacing w:line="360" w:lineRule="auto" w:after="60" w:before="0"/>
-        <w:jc w:val="center"/>
-      </w:pPr>
-      <w:r>
-        <w:rPr>
-          <w:rFonts w:ascii="Times New Roman" w:hAnsi="Times New Roman"/>
-          <w:b w:val="0"/>
-          <w:i w:val="0"/>
-          <w:sz w:val="24"/>
-        </w:rPr>
-        <w:t>Emmanuel Ponce Quiroga (Líder Técnico &amp; Gobernanza de IA)</w:t>
-      </w:r>
-    </w:p>
-    <w:p>
-      <w:pPr>
-        <w:spacing w:line="360" w:lineRule="auto" w:after="60" w:before="0"/>
-        <w:jc w:val="center"/>
-      </w:pPr>
-      <w:r>
-        <w:rPr>
-          <w:rFonts w:ascii="Times New Roman" w:hAnsi="Times New Roman"/>
-          <w:b w:val="0"/>
-          <w:i w:val="0"/>
-          <w:sz w:val="24"/>
-        </w:rPr>
-        <w:t>Jhoel Álvaro Cruz Zurita (Arquitectura VPS, Persistencia &amp; Múltiples DBs)</w:t>
+        <w:t>DOCENTE</w:t>
       </w:r>
     </w:p>
     <w:p>
@@ -179,7 +194,7 @@
           <w:i w:val="0"/>
           <w:sz w:val="24"/>
         </w:rPr>
-        <w:t>Luis Mario Rocha Vela (Aseguramiento de Calidad &amp; Estándares APA/IEEE)</w:t>
+        <w:t>Ing. Requena Llorentty Jimmy Nataniel</w:t>
       </w:r>
     </w:p>
     <w:p>
@@ -190,71 +205,11 @@
       <w:r>
         <w:rPr>
           <w:rFonts w:ascii="Times New Roman" w:hAnsi="Times New Roman"/>
-          <w:b/>
-          <w:i w:val="0"/>
-          <w:sz w:val="24"/>
-        </w:rPr>
-        <w:t>DOCENTES DE CÁTEDRA:</w:t>
-      </w:r>
-    </w:p>
-    <w:p>
-      <w:pPr>
-        <w:spacing w:line="360" w:lineRule="auto" w:after="480" w:before="0"/>
-        <w:jc w:val="center"/>
-      </w:pPr>
-      <w:r>
-        <w:rPr>
-          <w:rFonts w:ascii="Times New Roman" w:hAnsi="Times New Roman"/>
           <w:b w:val="0"/>
           <w:i w:val="0"/>
           <w:sz w:val="24"/>
         </w:rPr>
-        <w:t>Ing. Jimmy Nataniel Requena / Ing. Fernando Pardo</w:t>
-      </w:r>
-    </w:p>
-    <w:p>
-      <w:pPr>
-        <w:spacing w:line="360" w:lineRule="auto" w:after="80" w:before="0"/>
-        <w:jc w:val="center"/>
-      </w:pPr>
-      <w:r>
-        <w:rPr>
-          <w:rFonts w:ascii="Times New Roman" w:hAnsi="Times New Roman"/>
-          <w:b/>
-          <w:i w:val="0"/>
-          <w:sz w:val="24"/>
-        </w:rPr>
-        <w:t>STAKEHOLDER PEDAGÓGICA:</w:t>
-      </w:r>
-    </w:p>
-    <w:p>
-      <w:pPr>
-        <w:spacing w:line="360" w:lineRule="auto" w:after="800" w:before="0"/>
-        <w:jc w:val="center"/>
-      </w:pPr>
-      <w:r>
-        <w:rPr>
-          <w:rFonts w:ascii="Times New Roman" w:hAnsi="Times New Roman"/>
-          <w:b w:val="0"/>
-          <w:i w:val="0"/>
-          <w:sz w:val="24"/>
-        </w:rPr>
-        <w:t>Lic. María Elena Quispe Mamani (Docente Titular de Lengua Quechua — U.E. Simón Bolívar, Sucre)</w:t>
-      </w:r>
-    </w:p>
-    <w:p>
-      <w:pPr>
-        <w:spacing w:line="360" w:lineRule="auto" w:after="60" w:before="0"/>
-        <w:jc w:val="center"/>
-      </w:pPr>
-      <w:r>
-        <w:rPr>
-          <w:rFonts w:ascii="Times New Roman" w:hAnsi="Times New Roman"/>
-          <w:b w:val="0"/>
-          <w:i w:val="0"/>
-          <w:sz w:val="24"/>
-        </w:rPr>
-        <w:t>Santa Cruz de la Sierra / Sucre, Bolivia</w:t>
+        <w:t>Santa Cruz de la Sierra - Bolivia</w:t>
       </w:r>
     </w:p>
     <w:p>
@@ -303,7 +258,7 @@
           <w:i w:val="0"/>
           <w:sz w:val="24"/>
         </w:rPr>
-        <w:t>El presente documento técnico constituye el Álbum de Modelos UML y la Descripción del Diseño de Software (Software Design Description - SDD) para el proyecto YAPU (Sembradío en lengua quechua), desarrollado en estricto cumplimiento de los estándares internacionales IEEE Std 1016-2009 e IEEE Std 830-1998, conforme a las directrices del Gate 3 del ciclo de vida de desarrollo de software (SDLC) de la Universidad Privada Domingo Savio (UPDS). El proyecto YAPU es una Plataforma Web Progresiva (PWA) de alta resiliencia diseñada para la revitalización y enseñanza de la lengua quechua (variante sureña Collao/Chuquisaca), orientada a operar en comunidades urbanas y rurales con conectividad degradada (2G/3G) y smartphones de gama de entrada con Android 8.0+.</w:t>
+        <w:t>El presente informe formal documenta la Actividad 03: Álbum de Modelos UML correspondiente al Criterio de Verificación #2 (30 puntos) de la asignatura Ingeniería de Software I en la Universidad Privada Domingo Savio (Sede Santa Cruz de la Sierra). Enmarcado en el Gate 3 del ciclo de vida de desarrollo de software (SDLC), el documento adopta el estándar internacional IEEE Std 1016-2009 (Software Design Description - SDD) para formalizar la arquitectura y el diseño técnico del proyecto YAPU (Sembradío en lengua quechua), una Plataforma Web Progresiva (PWA) de alta resiliencia concebida para la enseñanza y revitalización de la lengua originaria quechua (variante sureña Collao/Chuquisaca) en el Estado Plurinacional de Bolivia.</w:t>
       </w:r>
     </w:p>
     <w:p>
@@ -318,7 +273,22 @@
           <w:i w:val="0"/>
           <w:sz w:val="24"/>
         </w:rPr>
-        <w:t>Este compendio traduce formalmente los 10 Requisitos Funcionales (RF-001 al RF-010), los Requisitos No Funcionales (RNF-001 al RNF-005) y los Requisitos de Sostenibilidad (RS-001 al RS-004) mediante 12 modelos visuales interconectados en Mermaid.js. Destacan: (1) una Arquitectura de 4 Capas basada en Astro SSG y Service Workers con consumo de RAM menor a 150 MB; (2) un Diagrama de Clases orientado a objetos con Inversión de Dependencias (DIP) y composición estricta; (3) una solución estructural multibase de datos que modela los schemas locales de IndexedDB (ObjectStores e índices) y los schemas documentales remotos de Cloud Firestore mediante Data Mappers; (4) un Motor de Inteligencia Artificial Determinista en TypeScript con coste cero ($0) en APIs y ausencia total de alucinaciones lingüísticas; (5) un protocolo de curaduría comunitaria bajo el principio de los cuatro ojos (autor_id != validador_id); y (6) una Matriz de Auditoría Ética de IA que registra el control humano ejercido sobre las decisiones arquitectónicas del sistema.</w:t>
+        <w:t>A lo largo del documento se operacionalizan los 10 Requisitos Funcionales (RF-001 al RF-010), los Requisitos No Funcionales (RNF-001 al RNF-005) y los Requisitos de Sostenibilidad (RS-001 al RS-004) formalizados previamente en la Especificación de Requisitos de Software (IEEE Std 830-1998). La solución se estructura en cuatro dimensiones arquitectónicas: (1) Vista Arquitectónica de 4 Capas con comunicación HTTP/2 y TLS 1.3 mediada por Service Worker (sin rombos de decisión condicional en la red); (2) Vista Estructural de Clases del Dominio con Inversión de Dependencias (SOLID) y composición estricta; (3) Vista Estructural de Persistencia Multibase de Datos que resuelve mediante el patrón Data Mapper la coexistencia entre la base de datos local en el navegador (IndexedDB con ObjectStores e índices) y la base de datos documental remota (Cloud Firestore NoSQL con subcolecciones); (4) Vista Funcional y Dinámica con casos de uso (include/extend), diagramas de secuencia en 5 fases, autómata de estados y algoritmos deterministas en TypeScript que aseguran coste cero ($0) en APIs, latencia menor a 50 ms y cero alucinaciones lingüísticas.</w:t>
+      </w:r>
+    </w:p>
+    <w:p>
+      <w:pPr>
+        <w:spacing w:line="360" w:lineRule="auto" w:after="120" w:before="0"/>
+        <w:jc w:val="left"/>
+      </w:pPr>
+      <w:r>
+        <w:rPr>
+          <w:rFonts w:ascii="Times New Roman" w:hAnsi="Times New Roman"/>
+          <w:b w:val="0"/>
+          <w:i w:val="0"/>
+          <w:sz w:val="24"/>
+        </w:rPr>
+        <w:t>Asimismo, en cumplimiento estricto de las exigencias éticas y de transparencia de la UPDS, se incluye una exhaustiva Matriz de Auditoría de Inteligencia Artificial que transparenta el uso de herramientas de IA como asistentes de diseño, documentando las decisiones aceptadas, las modificaciones críticas y los rechazos expresos efectuados por los estudiantes, acompañados de la evidencia de refinamiento de prompts y el análisis crítico de alucinaciones.</w:t>
       </w:r>
     </w:p>
     <w:p>
@@ -351,7 +321,7 @@
           <w:b/>
           <w:sz w:val="26"/>
         </w:rPr>
-        <w:t>1.1 Propósito y Alcance del Documento (IEEE Std 1016-2009)</w:t>
+        <w:t>1.1 El Estándar IEEE Std 1016-2009 (Software Design Description)</w:t>
       </w:r>
     </w:p>
     <w:p>
@@ -366,7 +336,7 @@
           <w:i w:val="0"/>
           <w:sz w:val="24"/>
         </w:rPr>
-        <w:t>El estándar IEEE Std 1016-2009 (Standard for Information Technology — Systems Design — Software Design Descriptions) define la estructura formal para representar las vistas de diseño de un sistema de software. Este documento traduce la Especificación de Requisitos de Software (SRS) del Bloque 2 en especificaciones de diseño modulares, auditables y verificables mediante modelos UML y esquemas de datos.</w:t>
+        <w:t>El estándar IEEE Std 1016-2009 define las directrices y puntos de vista recomendados para la descripción del diseño de software. Un SDD traduce los requerimientos del sistema en especificaciones de arquitectura, estructuras de datos, interfaces y algoritmos que sirven como puente riguroso entre la fase de especificación (Gate 2) y la fase de construcción (Gate 4).</w:t>
       </w:r>
     </w:p>
     <w:p>
@@ -380,7 +350,7 @@
           <w:b/>
           <w:sz w:val="26"/>
         </w:rPr>
-        <w:t>1.2 El Proyecto YAPU y el Contexto Territorial</w:t>
+        <w:t>1.2 Metodología de las 5 Secciones por Diagrama</w:t>
       </w:r>
     </w:p>
     <w:p>
@@ -395,7 +365,17 @@
           <w:i w:val="0"/>
           <w:sz w:val="24"/>
         </w:rPr>
-        <w:t>YAPU es una solución sociotécnica que responde a la alarmante pérdida de transmisión intergeneracional del quechua sureño en el departamento de Chuquisaca y zonas periurbanas de Sucre. En cumplimiento de la Constitución Política del Estado (Art. 5) y la Ley de Educación Avelino Siñani - Elizardo Pérez, el sistema proporciona una experiencia de aprendizaje gamificada cubriendo los primeros 10 niveles correspondientes al nivel A1 básico certificable.</w:t>
+        <w:t>Para garantizar un análisis de ingeniería exhaustivo y uniforme, cada diagrama de este álbum desarrolla cinco secciones técnicas obligatorias:</w:t>
+        <w:br/>
+        <w:t>1. Resumen Ejecutivo: Propósito arquitectónico y alcance específico del modelo.</w:t>
+        <w:br/>
+        <w:t>2. Diccionario de Clases / Elementos / Schemas: Definición de atributos con justificación técnica de tipos de datos y signaturas de operaciones.</w:t>
+        <w:br/>
+        <w:t>3. Análisis de Relaciones: Justificación técnica formal de por qué se empleó composición, agregación, herencia, realización o dependencia aplicando Principios SOLID.</w:t>
+        <w:br/>
+        <w:t>4. Seguridad, Integridad y Gobernanza: Políticas de protección de datos, aislamiento de red, inmutabilidad curricular y reglas de acceso.</w:t>
+        <w:br/>
+        <w:t>5. Guía de Explicación para Evaluación Oral: Argumentos clave y respuestas técnicas frente a preguntas trampa del tribunal docente.</w:t>
       </w:r>
     </w:p>
     <w:p>
@@ -409,7 +389,7 @@
           <w:b/>
           <w:sz w:val="26"/>
         </w:rPr>
-        <w:t>1.3 Estructura de Vistas Arquitectónicas</w:t>
+        <w:t>1.3 Contexto del Problema y Delimitación de YAPU</w:t>
       </w:r>
     </w:p>
     <w:p>
@@ -424,15 +404,7 @@
           <w:i w:val="0"/>
           <w:sz w:val="24"/>
         </w:rPr>
-        <w:t>Para garantizar una cobertura integral de los requerimientos, el Álbum de Modelos UML se organiza en cuatro vistas fundamentales:</w:t>
-        <w:br/>
-        <w:t>• Vista Arquitectónica y Física: Topología de 4 capas, componentes y protocolos de transporte (Diagrama 1).</w:t>
-        <w:br/>
-        <w:t>• Vista Estructural Orientada a Objetos: Clases del dominio pedagógico y clases de persistencia multibase de datos (Diagramas 2 y 3).</w:t>
-        <w:br/>
-        <w:t>• Vista de Persistencia de Datos: Diagrama Entidad-Relación (ERD) y taxonomía de relaciones fuertes y débiles (Diagrama 4).</w:t>
-        <w:br/>
-        <w:t>• Vista Funcional y de Comportamiento: Casos de uso general y específicos, diagramas de interacción (secuencia), máquinas de estado finito y diagramas de actividad (Diagramas 5 al 9).</w:t>
+        <w:t>YAPU aborda el fenómeno sociolingüístico de la pérdida de hablantes de quechua en Chuquisaca. Para garantizar inclusión en áreas rurales y periurbanas, el sistema impone restricciones técnicas críticas: operar en smartphones de gama de entrada con Android 8.0 con menos de 150 MB de memoria RAM en ejecución (RS-002), funcionar plenamente sin internet (RF-009) y prescindir de LLMs generativos externos para evitar costos y alucinaciones lingüísticas.</w:t>
       </w:r>
     </w:p>
     <w:p>
@@ -451,7 +423,7 @@
           <w:b/>
           <w:sz w:val="28"/>
         </w:rPr>
-        <w:t>CAPÍTULO II: VISTA ARQUITECTÓNICA Y FÍSICA</w:t>
+        <w:t>CAPÍTULO II: DIAGRAMA 1 — ARQUITECTURA GENERAL DEL SISTEMA</w:t>
       </w:r>
     </w:p>
     <w:p>
@@ -465,37 +437,7 @@
           <w:b/>
           <w:sz w:val="26"/>
         </w:rPr>
-        <w:t>2.1 Arquitectura General del Sistema (Topología de 4 Capas)</w:t>
-      </w:r>
-    </w:p>
-    <w:p>
-      <w:pPr>
-        <w:spacing w:line="360" w:lineRule="auto" w:after="120" w:before="0"/>
-        <w:jc w:val="left"/>
-      </w:pPr>
-      <w:r>
-        <w:rPr>
-          <w:rFonts w:ascii="Times New Roman" w:hAnsi="Times New Roman"/>
-          <w:b w:val="0"/>
-          <w:i w:val="0"/>
-          <w:sz w:val="24"/>
-        </w:rPr>
-        <w:t>El sistema se estructura en cuatro capas claramente desacopladas: Capa de Cliente (PWA Astro), Capa de Red Criptográfica, Capa de Servicios en la Nube (Google Firebase) y Capa de Infraestructura Autogestionada (VPS Linux UPDS con Nginx). En este diseño, la comunicación cliente-servidor se realiza mediante llamadas HTTP estándar sobre TLS 1.3. La aplicación no incluye rombos de decisión condicional en la red, ya que la mediación entre la memoria local y el tráfico de internet es gestionada de manera transparente por el Service Worker.</w:t>
-      </w:r>
-    </w:p>
-    <w:p>
-      <w:pPr>
-        <w:spacing w:before="200" w:after="80" w:line="360" w:lineRule="auto"/>
-        <w:jc w:val="left"/>
-      </w:pPr>
-      <w:r>
-        <w:rPr>
-          <w:rFonts w:ascii="Times New Roman" w:hAnsi="Times New Roman"/>
-          <w:b/>
-          <w:i/>
-          <w:sz w:val="24"/>
-        </w:rPr>
-        <w:t>Código Mermaid del Diagrama 1: Arquitectura General</w:t>
+        <w:t>2.1 Representación Arquitectónica (Mermaid)</w:t>
       </w:r>
     </w:p>
     <w:p>
@@ -511,55 +453,77 @@
         </w:rPr>
         <w:t>graph TB</w:t>
         <w:br/>
-        <w:t xml:space="preserve">  subgraph CLIENT_TIER [Capa de Cliente: PWA Ligera &lt; 150MB RAM]</w:t>
+        <w:t xml:space="preserve">    subgraph CLIENT_TIER [1. Capa de Cliente: PWA Ligera &lt; 150MB RAM]</w:t>
         <w:br/>
-        <w:t xml:space="preserve">    UI[Interfaz Astro SSG + Islands]</w:t>
+        <w:t xml:space="preserve">        UI[Interfaz Astro SSG + Islands Architecture]</w:t>
         <w:br/>
-        <w:t xml:space="preserve">    SW[Service Worker &amp; Workbox]</w:t>
+        <w:t xml:space="preserve">        SW[Service Worker &amp; Workbox Fetch Interceptor]</w:t>
         <w:br/>
-        <w:t xml:space="preserve">    CACHE_API[(Cache Storage API)]</w:t>
+        <w:t xml:space="preserve">        CACHE_API[(Cache Storage API: App Shell &amp; WebP)]</w:t>
         <w:br/>
-        <w:t xml:space="preserve">    IDB_LOCAL[(IndexedDB Local)]</w:t>
+        <w:t xml:space="preserve">        IDB_LOCAL[(IndexedDB Local: Evaluaciones y Cola)]</w:t>
         <w:br/>
-        <w:t xml:space="preserve">    CORE_AI[Motor IA Determinista en TS]</w:t>
+        <w:t xml:space="preserve">        subgraph CORE_AI [Motor IA Determinista en TypeScript]</w:t>
         <w:br/>
-        <w:t xml:space="preserve">  end</w:t>
+        <w:t xml:space="preserve">            GEN[Generador de Exámenes por Permutación]</w:t>
         <w:br/>
-        <w:t xml:space="preserve">  subgraph CLOUD_TIER [Servicios Cloud: Google Firebase]</w:t>
+        <w:t xml:space="preserve">            DIST[Filtro de Distractores Semánticos]</w:t>
         <w:br/>
-        <w:t xml:space="preserve">    FAUTH[Firebase Auth JWT]</w:t>
+        <w:t xml:space="preserve">            EVAL[Evaluador Local de Aciertos]</w:t>
         <w:br/>
-        <w:t xml:space="preserve">    FSTORE[Cloud Firestore NoSQL]</w:t>
+        <w:t xml:space="preserve">        end</w:t>
         <w:br/>
-        <w:t xml:space="preserve">    RULES[firestore.rules]</w:t>
+        <w:t xml:space="preserve">    end</w:t>
         <w:br/>
-        <w:t xml:space="preserve">  end</w:t>
+        <w:t xml:space="preserve">    subgraph CLOUD_TIER [2. Servicios Gestionados: Google Firebase]</w:t>
         <w:br/>
-        <w:t xml:space="preserve">  subgraph VPS_TIER [VPS Linux UPDS]</w:t>
+        <w:t xml:space="preserve">        FAUTH[Firebase Auth JWT &amp; Roles RBAC]</w:t>
         <w:br/>
-        <w:t xml:space="preserve">    NGINX[Reverse Proxy Nginx HTTP/2]</w:t>
+        <w:t xml:space="preserve">        FSTORE[Cloud Firestore NoSQL Engine]</w:t>
         <w:br/>
-        <w:t xml:space="preserve">    ASSETS[Repositorio Assets WebP &lt; 100KB]</w:t>
+        <w:t xml:space="preserve">        RULES[firestore.rules: Seguridad Declarativa]</w:t>
         <w:br/>
-        <w:t xml:space="preserve">    OPEN_DATA[Exportador Corpus CSV/JSON]</w:t>
+        <w:t xml:space="preserve">    end</w:t>
         <w:br/>
-        <w:t xml:space="preserve">  end</w:t>
+        <w:t xml:space="preserve">    subgraph VPS_TIER [3. Infraestructura Autogestionada: VPS UPDS]</w:t>
         <w:br/>
-        <w:t xml:space="preserve">  UI --&gt; SW</w:t>
+        <w:t xml:space="preserve">        NGINX[Reverse Proxy Nginx HTTP/2]</w:t>
         <w:br/>
-        <w:t xml:space="preserve">  SW --&gt; CACHE_API</w:t>
+        <w:t xml:space="preserve">        ASSETS[Repositorio Assets WebP &lt; 100KB]</w:t>
         <w:br/>
-        <w:t xml:space="preserve">  SW --&gt; IDB_LOCAL</w:t>
+        <w:t xml:space="preserve">        OPEN_DATA[Exportador Corpus Lingüístico CSV/JSON]</w:t>
         <w:br/>
-        <w:t xml:space="preserve">  UI --&gt; CORE_AI</w:t>
+        <w:t xml:space="preserve">    end</w:t>
         <w:br/>
-        <w:t xml:space="preserve">  SW --&gt;|HTTPS TLS 1.3| FAUTH</w:t>
+        <w:t xml:space="preserve">    UI --&gt; SW</w:t>
         <w:br/>
-        <w:t xml:space="preserve">  SW --&gt;|HTTPS TLS 1.3 / gRPC| FSTORE</w:t>
+        <w:t xml:space="preserve">    UI --&gt; CORE_AI</w:t>
         <w:br/>
-        <w:t xml:space="preserve">  SW --&gt;|HTTPS TLS 1.3| NGINX</w:t>
+        <w:t xml:space="preserve">    SW --&gt; CACHE_API</w:t>
         <w:br/>
-        <w:t xml:space="preserve">  IDB_LOCAL -.-&gt;|Background Sync API| FSTORE</w:t>
+        <w:t xml:space="preserve">    SW --&gt; IDB_LOCAL</w:t>
+        <w:br/>
+        <w:t xml:space="preserve">    SW --&gt;|HTTPS TLS 1.3 REST| FAUTH</w:t>
+        <w:br/>
+        <w:t xml:space="preserve">    SW --&gt;|HTTPS TLS 1.3 / gRPC| FSTORE</w:t>
+        <w:br/>
+        <w:t xml:space="preserve">    SW --&gt;|HTTPS TLS 1.3 HTTP/2| NGINX</w:t>
+        <w:br/>
+        <w:t xml:space="preserve">    IDB_LOCAL -.-&gt;|Background Sync API| FSTORE</w:t>
+      </w:r>
+    </w:p>
+    <w:p>
+      <w:pPr>
+        <w:spacing w:before="280" w:after="120" w:line="360" w:lineRule="auto"/>
+        <w:jc w:val="left"/>
+      </w:pPr>
+      <w:r>
+        <w:rPr>
+          <w:rFonts w:ascii="Times New Roman" w:hAnsi="Times New Roman"/>
+          <w:b/>
+          <w:sz w:val="26"/>
+        </w:rPr>
+        <w:t>2.2 Desglose Técnico IEEE 1016</w:t>
       </w:r>
     </w:p>
     <w:p>
@@ -574,7 +538,37 @@
           <w:i/>
           <w:sz w:val="24"/>
         </w:rPr>
-        <w:t>Tabla 1: Especificación de Componentes y Protocolos de Red</w:t>
+        <w:t>1. Resumen Ejecutivo</w:t>
+      </w:r>
+    </w:p>
+    <w:p>
+      <w:pPr>
+        <w:spacing w:line="360" w:lineRule="auto" w:after="120" w:before="0"/>
+        <w:jc w:val="left"/>
+      </w:pPr>
+      <w:r>
+        <w:rPr>
+          <w:rFonts w:ascii="Times New Roman" w:hAnsi="Times New Roman"/>
+          <w:b w:val="0"/>
+          <w:i w:val="0"/>
+          <w:sz w:val="24"/>
+        </w:rPr>
+        <w:t>Modela la topología física, lógica y de comunicaciones de YAPU, estructurada en tres niveles físicos y cuatro capas lógicas. El diseño elimina intermediaciones innecesarias: la aplicación emite peticiones HTTP estándar que son interceptadas de manera desacoplada por el Service Worker, garantizando que el software permanezca 100% operativo sin internet.</w:t>
+      </w:r>
+    </w:p>
+    <w:p>
+      <w:pPr>
+        <w:spacing w:before="200" w:after="80" w:line="360" w:lineRule="auto"/>
+        <w:jc w:val="left"/>
+      </w:pPr>
+      <w:r>
+        <w:rPr>
+          <w:rFonts w:ascii="Times New Roman" w:hAnsi="Times New Roman"/>
+          <w:b/>
+          <w:i/>
+          <w:sz w:val="24"/>
+        </w:rPr>
+        <w:t>2. Diccionario de Componentes y Nodos</w:t>
       </w:r>
     </w:p>
     <w:tbl>
@@ -709,7 +703,7 @@
           </w:tcPr>
           <w:p>
             <w:r>
-              <w:t>Cliente / Astro 4.x</w:t>
+              <w:t>Cliente PWA</w:t>
             </w:r>
           </w:p>
         </w:tc>
@@ -731,7 +725,7 @@
           </w:tcPr>
           <w:p>
             <w:r>
-              <w:t>Renderizado estático con cero JS por defecto. Consumo RAM &lt; 150MB (RS-002) y FCP &lt; 1.8s (RNF-001).</w:t>
+              <w:t>Renderizado estático en build time; solo hidrata islas interactivas activas. RAM &lt; 150MB y FCP &lt; 1.8s.</w:t>
             </w:r>
           </w:p>
         </w:tc>
@@ -780,7 +774,7 @@
           </w:tcPr>
           <w:p>
             <w:r>
-              <w:t>Cliente / Web Workers</w:t>
+              <w:t>Cliente Web Worker</w:t>
             </w:r>
           </w:p>
         </w:tc>
@@ -802,7 +796,7 @@
           </w:tcPr>
           <w:p>
             <w:r>
-              <w:t>Intercepta peticiones HTTP salientes. Aplica CacheFirst a medios y Background Sync a notas.</w:t>
+              <w:t>Intercepta el tráfico HTTP; sirve App Shell desde Cache Storage y canaliza transacciones a IndexedDB.</w:t>
             </w:r>
           </w:p>
         </w:tc>
@@ -829,7 +823,7 @@
               <w:rPr>
                 <w:b/>
               </w:rPr>
-              <w:t>IndexedDB</w:t>
+              <w:t>Motor IA en TypeScript</w:t>
             </w:r>
           </w:p>
         </w:tc>
@@ -851,7 +845,7 @@
           </w:tcPr>
           <w:p>
             <w:r>
-              <w:t>Cliente / Almacén NoSQL</w:t>
+              <w:t>Cliente Local</w:t>
             </w:r>
           </w:p>
         </w:tc>
@@ -873,7 +867,7 @@
           </w:tcPr>
           <w:p>
             <w:r>
-              <w:t>Persistencia transaccional no volátil en el navegador móvil para evaluaciones no sincronizadas.</w:t>
+              <w:t>Ejecutado enteramente en el navegador del teléfono móvil sin latencia de red ni consumo de cuotas.</w:t>
             </w:r>
           </w:p>
         </w:tc>
@@ -900,7 +894,7 @@
               <w:rPr>
                 <w:b/>
               </w:rPr>
-              <w:t>Cloud Firestore</w:t>
+              <w:t>Cloud Firestore NoSQL</w:t>
             </w:r>
           </w:p>
         </w:tc>
@@ -922,7 +916,7 @@
           </w:tcPr>
           <w:p>
             <w:r>
-              <w:t>Cloud / Google BaaS</w:t>
+              <w:t>Cloud Firebase BaaS</w:t>
             </w:r>
           </w:p>
         </w:tc>
@@ -944,7 +938,7 @@
           </w:tcPr>
           <w:p>
             <w:r>
-              <w:t>Base documental NoSQL multirregión con capacidad para absorber 500 sesiones concurrentes (RNF-005).</w:t>
+              <w:t>Base documental distribuida multirregión con absorción de hasta 500 sesiones concurrentes (RNF-005).</w:t>
             </w:r>
           </w:p>
         </w:tc>
@@ -971,7 +965,7 @@
               <w:rPr>
                 <w:b/>
               </w:rPr>
-              <w:t>Nginx HTTP/2 VPS</w:t>
+              <w:t>Reverse Proxy Nginx</w:t>
             </w:r>
           </w:p>
         </w:tc>
@@ -993,7 +987,7 @@
           </w:tcPr>
           <w:p>
             <w:r>
-              <w:t>VPS / Debian 12 UPDS</w:t>
+              <w:t>VPS Linux UPDS</w:t>
             </w:r>
           </w:p>
         </w:tc>
@@ -1015,12 +1009,108 @@
           </w:tcPr>
           <w:p>
             <w:r>
-              <w:t>Reverse proxy de activos WebP comprimidos (&lt; 100KB) y endpoint de datos abiertos (RS-004).</w:t>
+              <w:t>Servidor HTTP/2 sobre Debian 12 con compresión Brotli/Gzip para imágenes WebP &lt; 100KB y datos abiertos.</w:t>
             </w:r>
           </w:p>
         </w:tc>
       </w:tr>
     </w:tbl>
+    <w:p>
+      <w:pPr>
+        <w:spacing w:before="200" w:after="80" w:line="360" w:lineRule="auto"/>
+        <w:jc w:val="left"/>
+      </w:pPr>
+      <w:r>
+        <w:rPr>
+          <w:rFonts w:ascii="Times New Roman" w:hAnsi="Times New Roman"/>
+          <w:b/>
+          <w:i/>
+          <w:sz w:val="24"/>
+        </w:rPr>
+        <w:t>3. Análisis de Relaciones e Interfaces de Comunicación</w:t>
+      </w:r>
+    </w:p>
+    <w:p>
+      <w:pPr>
+        <w:spacing w:line="360" w:lineRule="auto" w:after="120" w:before="0"/>
+        <w:jc w:val="left"/>
+      </w:pPr>
+      <w:r>
+        <w:rPr>
+          <w:rFonts w:ascii="Times New Roman" w:hAnsi="Times New Roman"/>
+          <w:b w:val="0"/>
+          <w:i w:val="0"/>
+          <w:sz w:val="24"/>
+        </w:rPr>
+        <w:t>• Conectores HTTP/2 y TLS 1.3: Todo el tráfico entre el Service Worker y los servicios remotos (Firebase y Nginx) viaja cifrado con suite AES-GCM-256 sobre HTTPS.</w:t>
+        <w:br/>
+        <w:t>• Background Sync API: Conector asíncrono no bloqueante entre IndexedDB y Firestore. Si la conexión cae, las evaluaciones quedan almacenadas en la memoria local y el navegador dispara la sincronización automáticamente al detectar conectividad.</w:t>
+      </w:r>
+    </w:p>
+    <w:p>
+      <w:pPr>
+        <w:spacing w:before="200" w:after="80" w:line="360" w:lineRule="auto"/>
+        <w:jc w:val="left"/>
+      </w:pPr>
+      <w:r>
+        <w:rPr>
+          <w:rFonts w:ascii="Times New Roman" w:hAnsi="Times New Roman"/>
+          <w:b/>
+          <w:i/>
+          <w:sz w:val="24"/>
+        </w:rPr>
+        <w:t>4. Seguridad y Gobernanza</w:t>
+      </w:r>
+    </w:p>
+    <w:p>
+      <w:pPr>
+        <w:spacing w:line="360" w:lineRule="auto" w:after="120" w:before="0"/>
+        <w:jc w:val="left"/>
+      </w:pPr>
+      <w:r>
+        <w:rPr>
+          <w:rFonts w:ascii="Times New Roman" w:hAnsi="Times New Roman"/>
+          <w:b w:val="0"/>
+          <w:i w:val="0"/>
+          <w:sz w:val="24"/>
+        </w:rPr>
+        <w:t>• Reglas Declarativas (`firestore.rules`): Validan en el servidor que las escrituras coincidan con el UID del token JWT.</w:t>
+        <w:br/>
+        <w:t>• Aislamiento de Datos Abiertos (RS-004): El endpoint del VPS exporta el corpus léxico en CSV/JSON previa purga de cualquier dato de identificación personal.</w:t>
+      </w:r>
+    </w:p>
+    <w:p>
+      <w:pPr>
+        <w:spacing w:before="200" w:after="80" w:line="360" w:lineRule="auto"/>
+        <w:jc w:val="left"/>
+      </w:pPr>
+      <w:r>
+        <w:rPr>
+          <w:rFonts w:ascii="Times New Roman" w:hAnsi="Times New Roman"/>
+          <w:b/>
+          <w:i/>
+          <w:sz w:val="24"/>
+        </w:rPr>
+        <w:t>5. Guía de Explicación para Evaluación Oral</w:t>
+      </w:r>
+    </w:p>
+    <w:p>
+      <w:pPr>
+        <w:spacing w:line="360" w:lineRule="auto" w:after="120" w:before="0"/>
+        <w:jc w:val="left"/>
+      </w:pPr>
+      <w:r>
+        <w:rPr>
+          <w:rFonts w:ascii="Times New Roman" w:hAnsi="Times New Roman"/>
+          <w:b w:val="0"/>
+          <w:i w:val="0"/>
+          <w:sz w:val="24"/>
+        </w:rPr>
+        <w:t>• Pregunta: ¿Por qué en la arquitectura no hay un rombo de decisión para comprobar si hay internet antes de conectarse?</w:t>
+        <w:br/>
+        <w:t xml:space="preserve">  Respuesta: Porque un diagrama de arquitectura describe componentes, límites y protocolos de red, no control de flujo procedimental. En una PWA, la UI siempre despacha peticiones estándar HTTP; es el Service Worker quien resuelve si responde desde la Cache API o delega a la red. Colocar un rombo de decisión en la red es un error conceptual que confunde arquitectura con un diagrama de actividades.</w:t>
+      </w:r>
+    </w:p>
     <w:p>
       <w:r>
         <w:br w:type="page"/>
@@ -1037,7 +1127,7 @@
           <w:b/>
           <w:sz w:val="28"/>
         </w:rPr>
-        <w:t>CAPÍTULO III: VISTA ESTRUCTURAL ORIENTADA A OBJETOS (DOMINIO PEDAGÓGICO)</w:t>
+        <w:t>CAPÍTULO III: DIAGRAMA 2 — CLASES DEL DOMINIO PEDAGÓGICO Y MOTOR IA</w:t>
       </w:r>
     </w:p>
     <w:p>
@@ -1051,37 +1141,7 @@
           <w:b/>
           <w:sz w:val="26"/>
         </w:rPr>
-        <w:t>3.1 Diagrama de Clases del Dominio Pedagógico y Motor IA (Diagrama 2)</w:t>
-      </w:r>
-    </w:p>
-    <w:p>
-      <w:pPr>
-        <w:spacing w:line="360" w:lineRule="auto" w:after="120" w:before="0"/>
-        <w:jc w:val="left"/>
-      </w:pPr>
-      <w:r>
-        <w:rPr>
-          <w:rFonts w:ascii="Times New Roman" w:hAnsi="Times New Roman"/>
-          <w:b w:val="0"/>
-          <w:i w:val="0"/>
-          <w:sz w:val="24"/>
-        </w:rPr>
-        <w:t>El modelado de clases del núcleo de YAPU aplica rigurosamente los principios SOLID, en particular el Principio de Inversión de Dependencias (DIP) y el Principio de Responsabilidad Única (SRP). La clase EvaluationController interactúa exclusivamente con la interfaz abstracta IEvaluationEngine, lo que permite intercambiar el motor morfológico o inyectar objetos simulados (Mocks) en pruebas automatizadas sin tocar la interfaz gráfica.</w:t>
-      </w:r>
-    </w:p>
-    <w:p>
-      <w:pPr>
-        <w:spacing w:before="200" w:after="80" w:line="360" w:lineRule="auto"/>
-        <w:jc w:val="left"/>
-      </w:pPr>
-      <w:r>
-        <w:rPr>
-          <w:rFonts w:ascii="Times New Roman" w:hAnsi="Times New Roman"/>
-          <w:b/>
-          <w:i/>
-          <w:sz w:val="24"/>
-        </w:rPr>
-        <w:t>Código Mermaid del Diagrama 2: Clases del Dominio</w:t>
+        <w:t>3.1 Representación de Clases Orientada a Objetos (Mermaid)</w:t>
       </w:r>
     </w:p>
     <w:p>
@@ -1097,63 +1157,109 @@
         </w:rPr>
         <w:t>classDiagram</w:t>
         <w:br/>
-        <w:t xml:space="preserve">  class EvaluationController {</w:t>
+        <w:t xml:space="preserve">  namespace PresentationAndState {</w:t>
         <w:br/>
-        <w:t xml:space="preserve">    -IEvaluationEngine evaluationEngine</w:t>
+        <w:t xml:space="preserve">    class EvaluationController {</w:t>
         <w:br/>
-        <w:t xml:space="preserve">    -IOfflineFirstRepository repository</w:t>
+        <w:t xml:space="preserve">      -IEvaluationEngine evaluationEngine</w:t>
         <w:br/>
-        <w:t xml:space="preserve">    -StudentSession activeSession</w:t>
+        <w:t xml:space="preserve">      -IOfflineFirstRepository repository</w:t>
         <w:br/>
-        <w:t xml:space="preserve">    +initExam(levelId: int) void</w:t>
+        <w:t xml:space="preserve">      -StudentSession activeSession</w:t>
         <w:br/>
-        <w:t xml:space="preserve">    +submitAnswer(qId: String, opt: String) void</w:t>
+        <w:t xml:space="preserve">      +initExam(levelId: int) void</w:t>
         <w:br/>
-        <w:t xml:space="preserve">    +finalizeExam() EvaluationResult</w:t>
+        <w:t xml:space="preserve">      +submitAnswer(questionId: String, selectedOption: String) void</w:t>
+        <w:br/>
+        <w:t xml:space="preserve">      +finalizeExam() EvaluationResult</w:t>
+        <w:br/>
+        <w:t xml:space="preserve">    }</w:t>
+        <w:br/>
+        <w:t xml:space="preserve">    class StudentSession {</w:t>
+        <w:br/>
+        <w:t xml:space="preserve">      -String studentId</w:t>
+        <w:br/>
+        <w:t xml:space="preserve">      -int currentLevel</w:t>
+        <w:br/>
+        <w:t xml:space="preserve">      -int currentStreak</w:t>
+        <w:br/>
+        <w:t xml:space="preserve">      +updateStreak() void</w:t>
+        <w:br/>
+        <w:t xml:space="preserve">    }</w:t>
         <w:br/>
         <w:t xml:space="preserve">  }</w:t>
         <w:br/>
-        <w:t xml:space="preserve">  class Evaluation {</w:t>
+        <w:t xml:space="preserve">  namespace CoreLearningDomain {</w:t>
         <w:br/>
-        <w:t xml:space="preserve">    -String evaluationId</w:t>
+        <w:t xml:space="preserve">    class Evaluation {</w:t>
         <w:br/>
-        <w:t xml:space="preserve">    -String studentId</w:t>
+        <w:t xml:space="preserve">      -String evaluationId</w:t>
         <w:br/>
-        <w:t xml:space="preserve">    -int scorePercentage</w:t>
+        <w:t xml:space="preserve">      -String studentId</w:t>
         <w:br/>
-        <w:t xml:space="preserve">    +calculateScore() int</w:t>
+        <w:t xml:space="preserve">      -int levelId</w:t>
         <w:br/>
-        <w:t xml:space="preserve">    +isPassed() boolean</w:t>
+        <w:t xml:space="preserve">      -int scorePercentage</w:t>
+        <w:br/>
+        <w:t xml:space="preserve">      -boolean isSynchronized</w:t>
+        <w:br/>
+        <w:t xml:space="preserve">      +calculateScore() int</w:t>
+        <w:br/>
+        <w:t xml:space="preserve">      +isPassed() boolean</w:t>
+        <w:br/>
+        <w:t xml:space="preserve">    }</w:t>
+        <w:br/>
+        <w:t xml:space="preserve">    class Question {</w:t>
+        <w:br/>
+        <w:t xml:space="preserve">      -String questionId</w:t>
+        <w:br/>
+        <w:t xml:space="preserve">      -String statementText</w:t>
+        <w:br/>
+        <w:t xml:space="preserve">      -String correctOption</w:t>
+        <w:br/>
+        <w:t xml:space="preserve">      -List~String~ distractors</w:t>
+        <w:br/>
+        <w:t xml:space="preserve">      -boolean isCorrect</w:t>
+        <w:br/>
+        <w:t xml:space="preserve">      +evaluateAnswer(selected: String) boolean</w:t>
+        <w:br/>
+        <w:t xml:space="preserve">    }</w:t>
         <w:br/>
         <w:t xml:space="preserve">  }</w:t>
         <w:br/>
-        <w:t xml:space="preserve">  class Question {</w:t>
+        <w:t xml:space="preserve">  namespace SecurityAndDeterministicAI {</w:t>
         <w:br/>
-        <w:t xml:space="preserve">    -String questionId</w:t>
+        <w:t xml:space="preserve">    class IEvaluationEngine {</w:t>
         <w:br/>
-        <w:t xml:space="preserve">    -List~String~ distractors</w:t>
+        <w:t xml:space="preserve">      &lt;&lt;interface&gt;&gt;</w:t>
         <w:br/>
-        <w:t xml:space="preserve">    -boolean isCorrect</w:t>
+        <w:t xml:space="preserve">      +generateAssessment(levelId: int, baseCorpus: List~BaseSentence~) List~Question~</w:t>
         <w:br/>
-        <w:t xml:space="preserve">    +evaluateAnswer(selected: String) boolean</w:t>
+        <w:t xml:space="preserve">      +validateAnswerDeterministically(qId: String, selected: String) boolean</w:t>
         <w:br/>
-        <w:t xml:space="preserve">  }</w:t>
+        <w:t xml:space="preserve">    }</w:t>
         <w:br/>
-        <w:t xml:space="preserve">  class IEvaluationEngine {</w:t>
+        <w:t xml:space="preserve">    class DeterministicAIEngine {</w:t>
         <w:br/>
-        <w:t xml:space="preserve">    &lt;&lt;interface&gt;&gt;</w:t>
+        <w:t xml:space="preserve">      -int PASSING_THRESHOLD = 70</w:t>
         <w:br/>
-        <w:t xml:space="preserve">    +generateAssessment(levelId, corpus) List~Question~</w:t>
+        <w:t xml:space="preserve">      -int ITEMS_PER_TEST = 10</w:t>
         <w:br/>
-        <w:t xml:space="preserve">    +validateAnswerDeterministically(qId, sel) boolean</w:t>
+        <w:t xml:space="preserve">      +generateAssessment(levelId: int, baseCorpus: List~BaseSentence~) List~Question~</w:t>
         <w:br/>
-        <w:t xml:space="preserve">  }</w:t>
+        <w:t xml:space="preserve">    }</w:t>
         <w:br/>
-        <w:t xml:space="preserve">  class DeterministicAIEngine {</w:t>
+        <w:t xml:space="preserve">    class BaseSentence {</w:t>
         <w:br/>
-        <w:t xml:space="preserve">    -int PASSING_THRESHOLD = 70</w:t>
+        <w:t xml:space="preserve">      -String authorTeacherId</w:t>
         <w:br/>
-        <w:t xml:space="preserve">    +generateAssessment(levelId, corpus) List~Question~</w:t>
+        <w:t xml:space="preserve">      -String validatorTeacherId</w:t>
+        <w:br/>
+        <w:t xml:space="preserve">      -String culturalContext</w:t>
+        <w:br/>
+        <w:t xml:space="preserve">      +isApprovedForExams() boolean</w:t>
+        <w:br/>
+        <w:t xml:space="preserve">    }</w:t>
         <w:br/>
         <w:t xml:space="preserve">  }</w:t>
         <w:br/>
@@ -1177,7 +1283,22 @@
           <w:b/>
           <w:sz w:val="26"/>
         </w:rPr>
-        <w:t>3.2 Justificación de Relaciones Orientadas a Objetos</w:t>
+        <w:t>3.2 Desglose Técnico IEEE 1016</w:t>
+      </w:r>
+    </w:p>
+    <w:p>
+      <w:pPr>
+        <w:spacing w:before="200" w:after="80" w:line="360" w:lineRule="auto"/>
+        <w:jc w:val="left"/>
+      </w:pPr>
+      <w:r>
+        <w:rPr>
+          <w:rFonts w:ascii="Times New Roman" w:hAnsi="Times New Roman"/>
+          <w:b/>
+          <w:i/>
+          <w:sz w:val="24"/>
+        </w:rPr>
+        <w:t>1. Resumen Ejecutivo</w:t>
       </w:r>
     </w:p>
     <w:p>
@@ -1192,11 +1313,499 @@
           <w:i w:val="0"/>
           <w:sz w:val="24"/>
         </w:rPr>
-        <w:t>• Composición Estricta (Evaluation *-- Question): Cada reactivo de examen es generado al vuelo por el motor con permutaciones específicas para esa sesión. Las 10 preguntas carecen de valor ontológico o clave primaria natural fuera de la evaluación; si el examen se descarta o reintenta, sus 10 preguntas se destruyen en cascada en la memoria.</w:t>
+        <w:t>Modela la estructura estática del dominio pedagógico de YAPU, encapsulando la lógica de evaluación y generación algorítmica mediante abstracciones orientadas a objetos y bajo acoplamiento.</w:t>
+      </w:r>
+    </w:p>
+    <w:p>
+      <w:pPr>
+        <w:spacing w:before="200" w:after="80" w:line="360" w:lineRule="auto"/>
+        <w:jc w:val="left"/>
+      </w:pPr>
+      <w:r>
+        <w:rPr>
+          <w:rFonts w:ascii="Times New Roman" w:hAnsi="Times New Roman"/>
+          <w:b/>
+          <w:i/>
+          <w:sz w:val="24"/>
+        </w:rPr>
+        <w:t>2. Diccionario de Clases y Justificación de Tipos</w:t>
+      </w:r>
+    </w:p>
+    <w:tbl>
+      <w:tblPr>
+        <w:tblW w:type="auto" w:w="0"/>
+        <w:jc w:val="center"/>
+        <w:tblLook w:firstColumn="1" w:firstRow="1" w:lastColumn="0" w:lastRow="0" w:noHBand="0" w:noVBand="1" w:val="04A0"/>
+      </w:tblPr>
+      <w:tblGrid>
+        <w:gridCol w:w="3120"/>
+        <w:gridCol w:w="3120"/>
+        <w:gridCol w:w="3120"/>
+      </w:tblGrid>
+      <w:tr>
+        <w:tc>
+          <w:tcPr>
+            <w:tcW w:type="dxa" w:w="3120"/>
+            <w:tcBorders>
+              <w:top w:val="single" w:sz="12" w:space="0" w:color="000000"/>
+              <w:bottom w:val="single" w:sz="6" w:space="0" w:color="000000"/>
+              <w:left w:val="none"/>
+              <w:right w:val="none"/>
+            </w:tcBorders>
+            <w:tcMar>
+              <w:top w:w="70" w:type="dxa"/>
+              <w:bottom w:w="70" w:type="dxa"/>
+              <w:left w:w="100" w:type="dxa"/>
+              <w:right w:w="100" w:type="dxa"/>
+            </w:tcMar>
+          </w:tcPr>
+          <w:p>
+            <w:r>
+              <w:rPr>
+                <w:b/>
+              </w:rPr>
+              <w:t>Clase / Interfaz</w:t>
+            </w:r>
+          </w:p>
+        </w:tc>
+        <w:tc>
+          <w:tcPr>
+            <w:tcW w:type="dxa" w:w="3120"/>
+            <w:tcBorders>
+              <w:top w:val="single" w:sz="12" w:space="0" w:color="000000"/>
+              <w:bottom w:val="single" w:sz="6" w:space="0" w:color="000000"/>
+              <w:left w:val="none"/>
+              <w:right w:val="none"/>
+            </w:tcBorders>
+            <w:tcMar>
+              <w:top w:w="70" w:type="dxa"/>
+              <w:bottom w:w="70" w:type="dxa"/>
+              <w:left w:w="100" w:type="dxa"/>
+              <w:right w:w="100" w:type="dxa"/>
+            </w:tcMar>
+          </w:tcPr>
+          <w:p>
+            <w:r>
+              <w:rPr>
+                <w:b/>
+              </w:rPr>
+              <w:t>Atributos Críticos y Tipos</w:t>
+            </w:r>
+          </w:p>
+        </w:tc>
+        <w:tc>
+          <w:tcPr>
+            <w:tcW w:type="dxa" w:w="3120"/>
+            <w:tcBorders>
+              <w:top w:val="single" w:sz="12" w:space="0" w:color="000000"/>
+              <w:bottom w:val="single" w:sz="6" w:space="0" w:color="000000"/>
+              <w:left w:val="none"/>
+              <w:right w:val="none"/>
+            </w:tcBorders>
+            <w:tcMar>
+              <w:top w:w="70" w:type="dxa"/>
+              <w:bottom w:w="70" w:type="dxa"/>
+              <w:left w:w="100" w:type="dxa"/>
+              <w:right w:w="100" w:type="dxa"/>
+            </w:tcMar>
+          </w:tcPr>
+          <w:p>
+            <w:r>
+              <w:rPr>
+                <w:b/>
+              </w:rPr>
+              <w:t>Justificación Técnica de Tipos y Operaciones</w:t>
+            </w:r>
+          </w:p>
+        </w:tc>
+      </w:tr>
+      <w:tr>
+        <w:tc>
+          <w:tcPr>
+            <w:tcW w:type="dxa" w:w="3120"/>
+            <w:tcBorders>
+              <w:top w:val="none"/>
+              <w:bottom w:val="none"/>
+              <w:left w:val="none"/>
+              <w:right w:val="none"/>
+            </w:tcBorders>
+            <w:tcMar>
+              <w:top w:w="70" w:type="dxa"/>
+              <w:bottom w:w="70" w:type="dxa"/>
+              <w:left w:w="100" w:type="dxa"/>
+              <w:right w:w="100" w:type="dxa"/>
+            </w:tcMar>
+          </w:tcPr>
+          <w:p>
+            <w:r>
+              <w:rPr>
+                <w:b/>
+              </w:rPr>
+              <w:t>EvaluationController</w:t>
+            </w:r>
+          </w:p>
+        </w:tc>
+        <w:tc>
+          <w:tcPr>
+            <w:tcW w:type="dxa" w:w="3120"/>
+            <w:tcBorders>
+              <w:top w:val="none"/>
+              <w:bottom w:val="none"/>
+              <w:left w:val="none"/>
+              <w:right w:val="none"/>
+            </w:tcBorders>
+            <w:tcMar>
+              <w:top w:w="70" w:type="dxa"/>
+              <w:bottom w:w="70" w:type="dxa"/>
+              <w:left w:w="100" w:type="dxa"/>
+              <w:right w:w="100" w:type="dxa"/>
+            </w:tcMar>
+          </w:tcPr>
+          <w:p>
+            <w:r>
+              <w:t>IEvaluationEngine engine</w:t>
+              <w:br/>
+              <w:t>StudentSession session</w:t>
+            </w:r>
+          </w:p>
+        </w:tc>
+        <w:tc>
+          <w:tcPr>
+            <w:tcW w:type="dxa" w:w="3120"/>
+            <w:tcBorders>
+              <w:top w:val="none"/>
+              <w:bottom w:val="none"/>
+              <w:left w:val="none"/>
+              <w:right w:val="none"/>
+            </w:tcBorders>
+            <w:tcMar>
+              <w:top w:w="70" w:type="dxa"/>
+              <w:bottom w:w="70" w:type="dxa"/>
+              <w:left w:w="100" w:type="dxa"/>
+              <w:right w:w="100" w:type="dxa"/>
+            </w:tcMar>
+          </w:tcPr>
+          <w:p>
+            <w:r>
+              <w:t>Controlador GRASP desacoplado. Depende de interfaces para permitir pruebas unitarias automatizadas con Mocks.</w:t>
+            </w:r>
+          </w:p>
+        </w:tc>
+      </w:tr>
+      <w:tr>
+        <w:tc>
+          <w:tcPr>
+            <w:tcW w:type="dxa" w:w="3120"/>
+            <w:tcBorders>
+              <w:top w:val="none"/>
+              <w:bottom w:val="none"/>
+              <w:left w:val="none"/>
+              <w:right w:val="none"/>
+            </w:tcBorders>
+            <w:tcMar>
+              <w:top w:w="70" w:type="dxa"/>
+              <w:bottom w:w="70" w:type="dxa"/>
+              <w:left w:w="100" w:type="dxa"/>
+              <w:right w:w="100" w:type="dxa"/>
+            </w:tcMar>
+          </w:tcPr>
+          <w:p>
+            <w:r>
+              <w:rPr>
+                <w:b/>
+              </w:rPr>
+              <w:t>Evaluation</w:t>
+            </w:r>
+          </w:p>
+        </w:tc>
+        <w:tc>
+          <w:tcPr>
+            <w:tcW w:type="dxa" w:w="3120"/>
+            <w:tcBorders>
+              <w:top w:val="none"/>
+              <w:bottom w:val="none"/>
+              <w:left w:val="none"/>
+              <w:right w:val="none"/>
+            </w:tcBorders>
+            <w:tcMar>
+              <w:top w:w="70" w:type="dxa"/>
+              <w:bottom w:w="70" w:type="dxa"/>
+              <w:left w:w="100" w:type="dxa"/>
+              <w:right w:w="100" w:type="dxa"/>
+            </w:tcMar>
+          </w:tcPr>
+          <w:p>
+            <w:r>
+              <w:t>String evaluationId</w:t>
+              <w:br/>
+              <w:t>int scorePercentage</w:t>
+            </w:r>
+          </w:p>
+        </w:tc>
+        <w:tc>
+          <w:tcPr>
+            <w:tcW w:type="dxa" w:w="3120"/>
+            <w:tcBorders>
+              <w:top w:val="none"/>
+              <w:bottom w:val="none"/>
+              <w:left w:val="none"/>
+              <w:right w:val="none"/>
+            </w:tcBorders>
+            <w:tcMar>
+              <w:top w:w="70" w:type="dxa"/>
+              <w:bottom w:w="70" w:type="dxa"/>
+              <w:left w:w="100" w:type="dxa"/>
+              <w:right w:w="100" w:type="dxa"/>
+            </w:tcMar>
+          </w:tcPr>
+          <w:p>
+            <w:r>
+              <w:t>evaluationId tipado como String UUIDv4. scorePercentage se maneja como int [0..100] para evitar errores de precisión flotante.</w:t>
+            </w:r>
+          </w:p>
+        </w:tc>
+      </w:tr>
+      <w:tr>
+        <w:tc>
+          <w:tcPr>
+            <w:tcW w:type="dxa" w:w="3120"/>
+            <w:tcBorders>
+              <w:top w:val="none"/>
+              <w:bottom w:val="none"/>
+              <w:left w:val="none"/>
+              <w:right w:val="none"/>
+            </w:tcBorders>
+            <w:tcMar>
+              <w:top w:w="70" w:type="dxa"/>
+              <w:bottom w:w="70" w:type="dxa"/>
+              <w:left w:w="100" w:type="dxa"/>
+              <w:right w:w="100" w:type="dxa"/>
+            </w:tcMar>
+          </w:tcPr>
+          <w:p>
+            <w:r>
+              <w:rPr>
+                <w:b/>
+              </w:rPr>
+              <w:t>Question</w:t>
+            </w:r>
+          </w:p>
+        </w:tc>
+        <w:tc>
+          <w:tcPr>
+            <w:tcW w:type="dxa" w:w="3120"/>
+            <w:tcBorders>
+              <w:top w:val="none"/>
+              <w:bottom w:val="none"/>
+              <w:left w:val="none"/>
+              <w:right w:val="none"/>
+            </w:tcBorders>
+            <w:tcMar>
+              <w:top w:w="70" w:type="dxa"/>
+              <w:bottom w:w="70" w:type="dxa"/>
+              <w:left w:w="100" w:type="dxa"/>
+              <w:right w:w="100" w:type="dxa"/>
+            </w:tcMar>
+          </w:tcPr>
+          <w:p>
+            <w:r>
+              <w:t>List&lt;String&gt; distractors</w:t>
+              <w:br/>
+              <w:t>boolean isCorrect</w:t>
+            </w:r>
+          </w:p>
+        </w:tc>
+        <w:tc>
+          <w:tcPr>
+            <w:tcW w:type="dxa" w:w="3120"/>
+            <w:tcBorders>
+              <w:top w:val="none"/>
+              <w:bottom w:val="none"/>
+              <w:left w:val="none"/>
+              <w:right w:val="none"/>
+            </w:tcBorders>
+            <w:tcMar>
+              <w:top w:w="70" w:type="dxa"/>
+              <w:bottom w:w="70" w:type="dxa"/>
+              <w:left w:w="100" w:type="dxa"/>
+              <w:right w:w="100" w:type="dxa"/>
+            </w:tcMar>
+          </w:tcPr>
+          <w:p>
+            <w:r>
+              <w:t>Modela cada reactivo del examen. Contiene exactamente 3 distractores verosímiles de la misma categoría gramatical.</w:t>
+            </w:r>
+          </w:p>
+        </w:tc>
+      </w:tr>
+      <w:tr>
+        <w:tc>
+          <w:tcPr>
+            <w:tcW w:type="dxa" w:w="3120"/>
+            <w:tcBorders>
+              <w:top w:val="none"/>
+              <w:bottom w:val="single" w:sz="12" w:space="0" w:color="000000"/>
+              <w:left w:val="none"/>
+              <w:right w:val="none"/>
+            </w:tcBorders>
+            <w:tcMar>
+              <w:top w:w="70" w:type="dxa"/>
+              <w:bottom w:w="70" w:type="dxa"/>
+              <w:left w:w="100" w:type="dxa"/>
+              <w:right w:w="100" w:type="dxa"/>
+            </w:tcMar>
+          </w:tcPr>
+          <w:p>
+            <w:r>
+              <w:rPr>
+                <w:b/>
+              </w:rPr>
+              <w:t>IEvaluationEngine</w:t>
+            </w:r>
+          </w:p>
+        </w:tc>
+        <w:tc>
+          <w:tcPr>
+            <w:tcW w:type="dxa" w:w="3120"/>
+            <w:tcBorders>
+              <w:top w:val="none"/>
+              <w:bottom w:val="single" w:sz="12" w:space="0" w:color="000000"/>
+              <w:left w:val="none"/>
+              <w:right w:val="none"/>
+            </w:tcBorders>
+            <w:tcMar>
+              <w:top w:w="70" w:type="dxa"/>
+              <w:bottom w:w="70" w:type="dxa"/>
+              <w:left w:w="100" w:type="dxa"/>
+              <w:right w:w="100" w:type="dxa"/>
+            </w:tcMar>
+          </w:tcPr>
+          <w:p>
+            <w:r>
+              <w:t>generateAssessment()</w:t>
+              <w:br/>
+              <w:t>validateAnswer()</w:t>
+            </w:r>
+          </w:p>
+        </w:tc>
+        <w:tc>
+          <w:tcPr>
+            <w:tcW w:type="dxa" w:w="3120"/>
+            <w:tcBorders>
+              <w:top w:val="none"/>
+              <w:bottom w:val="single" w:sz="12" w:space="0" w:color="000000"/>
+              <w:left w:val="none"/>
+              <w:right w:val="none"/>
+            </w:tcBorders>
+            <w:tcMar>
+              <w:top w:w="70" w:type="dxa"/>
+              <w:bottom w:w="70" w:type="dxa"/>
+              <w:left w:w="100" w:type="dxa"/>
+              <w:right w:w="100" w:type="dxa"/>
+            </w:tcMar>
+          </w:tcPr>
+          <w:p>
+            <w:r>
+              <w:t>Contrato abstracto de evaluación. Permite sustituir la implementación del motor sin alterar la UI ni la controladora.</w:t>
+            </w:r>
+          </w:p>
+        </w:tc>
+      </w:tr>
+    </w:tbl>
+    <w:p>
+      <w:pPr>
+        <w:spacing w:before="200" w:after="80" w:line="360" w:lineRule="auto"/>
+        <w:jc w:val="left"/>
+      </w:pPr>
+      <w:r>
+        <w:rPr>
+          <w:rFonts w:ascii="Times New Roman" w:hAnsi="Times New Roman"/>
+          <w:b/>
+          <w:i/>
+          <w:sz w:val="24"/>
+        </w:rPr>
+        <w:t>3. Análisis de Relaciones SOLID</w:t>
+      </w:r>
+    </w:p>
+    <w:p>
+      <w:pPr>
+        <w:spacing w:line="360" w:lineRule="auto" w:after="120" w:before="0"/>
+        <w:jc w:val="left"/>
+      </w:pPr>
+      <w:r>
+        <w:rPr>
+          <w:rFonts w:ascii="Times New Roman" w:hAnsi="Times New Roman"/>
+          <w:b w:val="0"/>
+          <w:i w:val="0"/>
+          <w:sz w:val="24"/>
+        </w:rPr>
+        <w:t>• Composición Estricta (`Evaluation *-- Question`): Las 10 preguntas carecen de ciclo de vida o identidad ontológica fuera de la evaluación en que se generaron; si la evaluación se destruye o reinicia, las preguntas se purgan simultáneamente.</w:t>
         <w:br/>
-        <w:t>• Agregación (EvaluationController o-- StudentSession): La sesión del estudiante preexiste y sobrevive al examen individual. El controlador la referencia para actualizar rachas de estudio pero no controla exclusivamente su ciclo de vida.</w:t>
+        <w:t>• Agregación (`EvaluationController o-- StudentSession`): La sesión del estudiante preexiste a cualquier examen individual y sobrevive a él.</w:t>
         <w:br/>
-        <w:t>• Realización (IEvaluationEngine &lt;|.. DeterministicAIEngine): Implementación pura de contrato sin estado compartido.</w:t>
+        <w:t>• Inversión de Dependencias (DIP): `EvaluationController` depende de `IEvaluationEngine`, no de la clase concreta `DeterministicAIEngine`.</w:t>
+      </w:r>
+    </w:p>
+    <w:p>
+      <w:pPr>
+        <w:spacing w:before="200" w:after="80" w:line="360" w:lineRule="auto"/>
+        <w:jc w:val="left"/>
+      </w:pPr>
+      <w:r>
+        <w:rPr>
+          <w:rFonts w:ascii="Times New Roman" w:hAnsi="Times New Roman"/>
+          <w:b/>
+          <w:i/>
+          <w:sz w:val="24"/>
+        </w:rPr>
+        <w:t>4. Seguridad y Determinismo Algorítmico</w:t>
+      </w:r>
+    </w:p>
+    <w:p>
+      <w:pPr>
+        <w:spacing w:line="360" w:lineRule="auto" w:after="120" w:before="0"/>
+        <w:jc w:val="left"/>
+      </w:pPr>
+      <w:r>
+        <w:rPr>
+          <w:rFonts w:ascii="Times New Roman" w:hAnsi="Times New Roman"/>
+          <w:b w:val="0"/>
+          <w:i w:val="0"/>
+          <w:sz w:val="24"/>
+        </w:rPr>
+        <w:t>El motor opera con funciones puras en TypeScript. A partir de una semilla determinista y un banco estático certificado, la salida es matemáticamente predecible y reproducible, eliminando por completo cualquier riesgo de alucinación lingüística.</w:t>
+      </w:r>
+    </w:p>
+    <w:p>
+      <w:pPr>
+        <w:spacing w:before="200" w:after="80" w:line="360" w:lineRule="auto"/>
+        <w:jc w:val="left"/>
+      </w:pPr>
+      <w:r>
+        <w:rPr>
+          <w:rFonts w:ascii="Times New Roman" w:hAnsi="Times New Roman"/>
+          <w:b/>
+          <w:i/>
+          <w:sz w:val="24"/>
+        </w:rPr>
+        <w:t>5. Guía de Evaluación Oral</w:t>
+      </w:r>
+    </w:p>
+    <w:p>
+      <w:pPr>
+        <w:spacing w:line="360" w:lineRule="auto" w:after="120" w:before="0"/>
+        <w:jc w:val="left"/>
+      </w:pPr>
+      <w:r>
+        <w:rPr>
+          <w:rFonts w:ascii="Times New Roman" w:hAnsi="Times New Roman"/>
+          <w:b w:val="0"/>
+          <w:i w:val="0"/>
+          <w:sz w:val="24"/>
+        </w:rPr>
+        <w:t>• Pregunta: ¿Por qué la relación entre Evaluation y Question no es agregación?</w:t>
+        <w:br/>
+        <w:t xml:space="preserve">  Respuesta: Porque una agregación implicaría que una pregunta puede existir de forma independiente sin una evaluación. En YAPU, las preguntas se sintetizan dinámicamente con permutaciones específicas para ese intento. No existe una pregunta huérfana en el sistema.</w:t>
       </w:r>
     </w:p>
     <w:p>
@@ -1215,7 +1824,7 @@
           <w:b/>
           <w:sz w:val="28"/>
         </w:rPr>
-        <w:t>CAPÍTULO IV: VISTA ESTRUCTURAL DE PERSISTENCIA MULTIBASE DE DATOS</w:t>
+        <w:t>CAPÍTULO IV: DIAGRAMA 3 — PERSISTENCIA MULTIBASE DE DATOS (INDEXEDDB VS FIRESTORE)</w:t>
       </w:r>
     </w:p>
     <w:p>
@@ -1229,37 +1838,7 @@
           <w:b/>
           <w:sz w:val="26"/>
         </w:rPr>
-        <w:t>4.1 Resolución Estructural para Múltiples Bases de Datos (Diagrama 3)</w:t>
-      </w:r>
-    </w:p>
-    <w:p>
-      <w:pPr>
-        <w:spacing w:line="360" w:lineRule="auto" w:after="120" w:before="0"/>
-        <w:jc w:val="left"/>
-      </w:pPr>
-      <w:r>
-        <w:rPr>
-          <w:rFonts w:ascii="Times New Roman" w:hAnsi="Times New Roman"/>
-          <w:b w:val="0"/>
-          <w:i w:val="0"/>
-          <w:sz w:val="24"/>
-        </w:rPr>
-        <w:t>En arquitecturas Offline-First coexisten múltiples motores de almacenamiento con distintos paradigmas: una base NoSQL local en el cliente (IndexedDB) optimizada para lecturas y escrituras atómicas en memoria flash, y una base documental remota en la nube (Cloud Firestore) con replicación multirregión. En UML, esta disparidad se resuelve separando las Entidades de Negocio, los Schemas Físicos de cada motor, los Data Mappers de transformación y el Repositorio Unificado.</w:t>
-      </w:r>
-    </w:p>
-    <w:p>
-      <w:pPr>
-        <w:spacing w:before="200" w:after="80" w:line="360" w:lineRule="auto"/>
-        <w:jc w:val="left"/>
-      </w:pPr>
-      <w:r>
-        <w:rPr>
-          <w:rFonts w:ascii="Times New Roman" w:hAnsi="Times New Roman"/>
-          <w:b/>
-          <w:i/>
-          <w:sz w:val="24"/>
-        </w:rPr>
-        <w:t>Código Mermaid del Diagrama 3: Persistencia Multibase</w:t>
+        <w:t>4.1 Representación de Clases de Persistencia Multibase (Mermaid)</w:t>
       </w:r>
     </w:p>
     <w:p>
@@ -1285,6 +1864,8 @@
         <w:br/>
         <w:t xml:space="preserve">      +String syncStatus : index_by_status</w:t>
         <w:br/>
+        <w:t xml:space="preserve">      +int scorePercentage</w:t>
+        <w:br/>
         <w:t xml:space="preserve">      +String questionsPayloadJSON</w:t>
         <w:br/>
         <w:t xml:space="preserve">    }</w:t>
@@ -1293,7 +1874,11 @@
         <w:br/>
         <w:t xml:space="preserve">      +String queueId : keyPath</w:t>
         <w:br/>
+        <w:t xml:space="preserve">      +String entityType : index_by_entity</w:t>
+        <w:br/>
         <w:t xml:space="preserve">      +String operationType</w:t>
+        <w:br/>
+        <w:t xml:space="preserve">      +String payloadJSON</w:t>
         <w:br/>
         <w:t xml:space="preserve">      +int retryCount</w:t>
         <w:br/>
@@ -1311,6 +1896,8 @@
         <w:br/>
         <w:t xml:space="preserve">      +Timestamp createdAt : server_timestamp</w:t>
         <w:br/>
+        <w:t xml:space="preserve">      +int scorePercentage</w:t>
+        <w:br/>
         <w:t xml:space="preserve">    }</w:t>
         <w:br/>
         <w:t xml:space="preserve">    class FirestoreQuestionSubdocument {</w:t>
@@ -1319,11 +1906,15 @@
         <w:br/>
         <w:t xml:space="preserve">      +String statementText</w:t>
         <w:br/>
+        <w:t xml:space="preserve">      +String correctOption</w:t>
+        <w:br/>
+        <w:t xml:space="preserve">      +boolean isCorrect</w:t>
+        <w:br/>
         <w:t xml:space="preserve">    }</w:t>
         <w:br/>
         <w:t xml:space="preserve">  }</w:t>
         <w:br/>
-        <w:t xml:space="preserve">  namespace Mappers_And_Repositories {</w:t>
+        <w:t xml:space="preserve">  namespace MappersAndCoordination {</w:t>
         <w:br/>
         <w:t xml:space="preserve">    class EvaluationLocalMapper {</w:t>
         <w:br/>
@@ -1369,7 +1960,22 @@
           <w:b/>
           <w:sz w:val="26"/>
         </w:rPr>
-        <w:t>4.2 Justificación Técnica de Schemas Físicos y Mappers</w:t>
+        <w:t>4.2 Desglose Técnico IEEE 1016</w:t>
+      </w:r>
+    </w:p>
+    <w:p>
+      <w:pPr>
+        <w:spacing w:before="200" w:after="80" w:line="360" w:lineRule="auto"/>
+        <w:jc w:val="left"/>
+      </w:pPr>
+      <w:r>
+        <w:rPr>
+          <w:rFonts w:ascii="Times New Roman" w:hAnsi="Times New Roman"/>
+          <w:b/>
+          <w:i/>
+          <w:sz w:val="24"/>
+        </w:rPr>
+        <w:t>1. Resumen Ejecutivo</w:t>
       </w:r>
     </w:p>
     <w:p>
@@ -1384,11 +1990,489 @@
           <w:i w:val="0"/>
           <w:sz w:val="24"/>
         </w:rPr>
-        <w:t>• Schema IndexedDB (EvaluationStoreRecord): Emplea evaluationId como keyPath y define índices B-Tree (by_level, by_status) para filtrado instantáneo en el móvil. Las preguntas se serializan en un solo campo JSON (questionsPayloadJSON) para ejecutar una única transacción de I/O por evaluación, minimizando el desgaste de la memoria flash del smartphone.</w:t>
+        <w:t>Modela la arquitectura estructural que resuelve la convivencia entre dos motores de base de datos con paradigmas distintos: IndexedDB en el cliente móvil y Cloud Firestore NoSQL en la nube. Aplica los patrones Data Mapper y Offline-First Repository para mantener las entidades del dominio completamente independientes de la tecnología física de persistencia.</w:t>
+      </w:r>
+    </w:p>
+    <w:p>
+      <w:pPr>
+        <w:spacing w:before="200" w:after="80" w:line="360" w:lineRule="auto"/>
+        <w:jc w:val="left"/>
+      </w:pPr>
+      <w:r>
+        <w:rPr>
+          <w:rFonts w:ascii="Times New Roman" w:hAnsi="Times New Roman"/>
+          <w:b/>
+          <w:i/>
+          <w:sz w:val="24"/>
+        </w:rPr>
+        <w:t>2. Diccionario de Schemas y Mappers</w:t>
+      </w:r>
+    </w:p>
+    <w:tbl>
+      <w:tblPr>
+        <w:tblW w:type="auto" w:w="0"/>
+        <w:jc w:val="center"/>
+        <w:tblLook w:firstColumn="1" w:firstRow="1" w:lastColumn="0" w:lastRow="0" w:noHBand="0" w:noVBand="1" w:val="04A0"/>
+      </w:tblPr>
+      <w:tblGrid>
+        <w:gridCol w:w="3120"/>
+        <w:gridCol w:w="3120"/>
+        <w:gridCol w:w="3120"/>
+      </w:tblGrid>
+      <w:tr>
+        <w:tc>
+          <w:tcPr>
+            <w:tcW w:type="dxa" w:w="3120"/>
+            <w:tcBorders>
+              <w:top w:val="single" w:sz="12" w:space="0" w:color="000000"/>
+              <w:bottom w:val="single" w:sz="6" w:space="0" w:color="000000"/>
+              <w:left w:val="none"/>
+              <w:right w:val="none"/>
+            </w:tcBorders>
+            <w:tcMar>
+              <w:top w:w="70" w:type="dxa"/>
+              <w:bottom w:w="70" w:type="dxa"/>
+              <w:left w:w="100" w:type="dxa"/>
+              <w:right w:w="100" w:type="dxa"/>
+            </w:tcMar>
+          </w:tcPr>
+          <w:p>
+            <w:r>
+              <w:rPr>
+                <w:b/>
+              </w:rPr>
+              <w:t>Elemento / Schema</w:t>
+            </w:r>
+          </w:p>
+        </w:tc>
+        <w:tc>
+          <w:tcPr>
+            <w:tcW w:type="dxa" w:w="3120"/>
+            <w:tcBorders>
+              <w:top w:val="single" w:sz="12" w:space="0" w:color="000000"/>
+              <w:bottom w:val="single" w:sz="6" w:space="0" w:color="000000"/>
+              <w:left w:val="none"/>
+              <w:right w:val="none"/>
+            </w:tcBorders>
+            <w:tcMar>
+              <w:top w:w="70" w:type="dxa"/>
+              <w:bottom w:w="70" w:type="dxa"/>
+              <w:left w:w="100" w:type="dxa"/>
+              <w:right w:w="100" w:type="dxa"/>
+            </w:tcMar>
+          </w:tcPr>
+          <w:p>
+            <w:r>
+              <w:rPr>
+                <w:b/>
+              </w:rPr>
+              <w:t>Motor / Paradigma</w:t>
+            </w:r>
+          </w:p>
+        </w:tc>
+        <w:tc>
+          <w:tcPr>
+            <w:tcW w:type="dxa" w:w="3120"/>
+            <w:tcBorders>
+              <w:top w:val="single" w:sz="12" w:space="0" w:color="000000"/>
+              <w:bottom w:val="single" w:sz="6" w:space="0" w:color="000000"/>
+              <w:left w:val="none"/>
+              <w:right w:val="none"/>
+            </w:tcBorders>
+            <w:tcMar>
+              <w:top w:w="70" w:type="dxa"/>
+              <w:bottom w:w="70" w:type="dxa"/>
+              <w:left w:w="100" w:type="dxa"/>
+              <w:right w:w="100" w:type="dxa"/>
+            </w:tcMar>
+          </w:tcPr>
+          <w:p>
+            <w:r>
+              <w:rPr>
+                <w:b/>
+              </w:rPr>
+              <w:t>Justificación Técnica de Ingeniería</w:t>
+            </w:r>
+          </w:p>
+        </w:tc>
+      </w:tr>
+      <w:tr>
+        <w:tc>
+          <w:tcPr>
+            <w:tcW w:type="dxa" w:w="3120"/>
+            <w:tcBorders>
+              <w:top w:val="none"/>
+              <w:bottom w:val="none"/>
+              <w:left w:val="none"/>
+              <w:right w:val="none"/>
+            </w:tcBorders>
+            <w:tcMar>
+              <w:top w:w="70" w:type="dxa"/>
+              <w:bottom w:w="70" w:type="dxa"/>
+              <w:left w:w="100" w:type="dxa"/>
+              <w:right w:w="100" w:type="dxa"/>
+            </w:tcMar>
+          </w:tcPr>
+          <w:p>
+            <w:r>
+              <w:rPr>
+                <w:b/>
+              </w:rPr>
+              <w:t>EvaluationStoreRecord</w:t>
+            </w:r>
+          </w:p>
+        </w:tc>
+        <w:tc>
+          <w:tcPr>
+            <w:tcW w:type="dxa" w:w="3120"/>
+            <w:tcBorders>
+              <w:top w:val="none"/>
+              <w:bottom w:val="none"/>
+              <w:left w:val="none"/>
+              <w:right w:val="none"/>
+            </w:tcBorders>
+            <w:tcMar>
+              <w:top w:w="70" w:type="dxa"/>
+              <w:bottom w:w="70" w:type="dxa"/>
+              <w:left w:w="100" w:type="dxa"/>
+              <w:right w:w="100" w:type="dxa"/>
+            </w:tcMar>
+          </w:tcPr>
+          <w:p>
+            <w:r>
+              <w:t>IndexedDB (Cliente)</w:t>
+            </w:r>
+          </w:p>
+        </w:tc>
+        <w:tc>
+          <w:tcPr>
+            <w:tcW w:type="dxa" w:w="3120"/>
+            <w:tcBorders>
+              <w:top w:val="none"/>
+              <w:bottom w:val="none"/>
+              <w:left w:val="none"/>
+              <w:right w:val="none"/>
+            </w:tcBorders>
+            <w:tcMar>
+              <w:top w:w="70" w:type="dxa"/>
+              <w:bottom w:w="70" w:type="dxa"/>
+              <w:left w:w="100" w:type="dxa"/>
+              <w:right w:w="100" w:type="dxa"/>
+            </w:tcMar>
+          </w:tcPr>
+          <w:p>
+            <w:r>
+              <w:t>ObjectStore indexado. Usa evaluationId como keyPath e índices B-Tree. Serializa preguntas en JSON para I/O atómico en memoria flash.</w:t>
+            </w:r>
+          </w:p>
+        </w:tc>
+      </w:tr>
+      <w:tr>
+        <w:tc>
+          <w:tcPr>
+            <w:tcW w:type="dxa" w:w="3120"/>
+            <w:tcBorders>
+              <w:top w:val="none"/>
+              <w:bottom w:val="none"/>
+              <w:left w:val="none"/>
+              <w:right w:val="none"/>
+            </w:tcBorders>
+            <w:tcMar>
+              <w:top w:w="70" w:type="dxa"/>
+              <w:bottom w:w="70" w:type="dxa"/>
+              <w:left w:w="100" w:type="dxa"/>
+              <w:right w:w="100" w:type="dxa"/>
+            </w:tcMar>
+          </w:tcPr>
+          <w:p>
+            <w:r>
+              <w:rPr>
+                <w:b/>
+              </w:rPr>
+              <w:t>SyncQueueRecord</w:t>
+            </w:r>
+          </w:p>
+        </w:tc>
+        <w:tc>
+          <w:tcPr>
+            <w:tcW w:type="dxa" w:w="3120"/>
+            <w:tcBorders>
+              <w:top w:val="none"/>
+              <w:bottom w:val="none"/>
+              <w:left w:val="none"/>
+              <w:right w:val="none"/>
+            </w:tcBorders>
+            <w:tcMar>
+              <w:top w:w="70" w:type="dxa"/>
+              <w:bottom w:w="70" w:type="dxa"/>
+              <w:left w:w="100" w:type="dxa"/>
+              <w:right w:w="100" w:type="dxa"/>
+            </w:tcMar>
+          </w:tcPr>
+          <w:p>
+            <w:r>
+              <w:t>IndexedDB (Cliente)</w:t>
+            </w:r>
+          </w:p>
+        </w:tc>
+        <w:tc>
+          <w:tcPr>
+            <w:tcW w:type="dxa" w:w="3120"/>
+            <w:tcBorders>
+              <w:top w:val="none"/>
+              <w:bottom w:val="none"/>
+              <w:left w:val="none"/>
+              <w:right w:val="none"/>
+            </w:tcBorders>
+            <w:tcMar>
+              <w:top w:w="70" w:type="dxa"/>
+              <w:bottom w:w="70" w:type="dxa"/>
+              <w:left w:w="100" w:type="dxa"/>
+              <w:right w:w="100" w:type="dxa"/>
+            </w:tcMar>
+          </w:tcPr>
+          <w:p>
+            <w:r>
+              <w:t>Cola persistente de mutaciones no sincronizadas. Registra reintentos y orden FIFO para el Service Worker.</w:t>
+            </w:r>
+          </w:p>
+        </w:tc>
+      </w:tr>
+      <w:tr>
+        <w:tc>
+          <w:tcPr>
+            <w:tcW w:type="dxa" w:w="3120"/>
+            <w:tcBorders>
+              <w:top w:val="none"/>
+              <w:bottom w:val="none"/>
+              <w:left w:val="none"/>
+              <w:right w:val="none"/>
+            </w:tcBorders>
+            <w:tcMar>
+              <w:top w:w="70" w:type="dxa"/>
+              <w:bottom w:w="70" w:type="dxa"/>
+              <w:left w:w="100" w:type="dxa"/>
+              <w:right w:w="100" w:type="dxa"/>
+            </w:tcMar>
+          </w:tcPr>
+          <w:p>
+            <w:r>
+              <w:rPr>
+                <w:b/>
+              </w:rPr>
+              <w:t>FirestoreEvaluationDocument</w:t>
+            </w:r>
+          </w:p>
+        </w:tc>
+        <w:tc>
+          <w:tcPr>
+            <w:tcW w:type="dxa" w:w="3120"/>
+            <w:tcBorders>
+              <w:top w:val="none"/>
+              <w:bottom w:val="none"/>
+              <w:left w:val="none"/>
+              <w:right w:val="none"/>
+            </w:tcBorders>
+            <w:tcMar>
+              <w:top w:w="70" w:type="dxa"/>
+              <w:bottom w:w="70" w:type="dxa"/>
+              <w:left w:w="100" w:type="dxa"/>
+              <w:right w:w="100" w:type="dxa"/>
+            </w:tcMar>
+          </w:tcPr>
+          <w:p>
+            <w:r>
+              <w:t>Firestore (Nube)</w:t>
+            </w:r>
+          </w:p>
+        </w:tc>
+        <w:tc>
+          <w:tcPr>
+            <w:tcW w:type="dxa" w:w="3120"/>
+            <w:tcBorders>
+              <w:top w:val="none"/>
+              <w:bottom w:val="none"/>
+              <w:left w:val="none"/>
+              <w:right w:val="none"/>
+            </w:tcBorders>
+            <w:tcMar>
+              <w:top w:w="70" w:type="dxa"/>
+              <w:bottom w:w="70" w:type="dxa"/>
+              <w:left w:w="100" w:type="dxa"/>
+              <w:right w:w="100" w:type="dxa"/>
+            </w:tcMar>
+          </w:tcPr>
+          <w:p>
+            <w:r>
+              <w:t>Documento NoSQL en /evaluaciones/{id}. Almacena studentUid y Timestamp nativo de Google (server_timestamp) para auditoría.</w:t>
+            </w:r>
+          </w:p>
+        </w:tc>
+      </w:tr>
+      <w:tr>
+        <w:tc>
+          <w:tcPr>
+            <w:tcW w:type="dxa" w:w="3120"/>
+            <w:tcBorders>
+              <w:top w:val="none"/>
+              <w:bottom w:val="single" w:sz="12" w:space="0" w:color="000000"/>
+              <w:left w:val="none"/>
+              <w:right w:val="none"/>
+            </w:tcBorders>
+            <w:tcMar>
+              <w:top w:w="70" w:type="dxa"/>
+              <w:bottom w:w="70" w:type="dxa"/>
+              <w:left w:w="100" w:type="dxa"/>
+              <w:right w:w="100" w:type="dxa"/>
+            </w:tcMar>
+          </w:tcPr>
+          <w:p>
+            <w:r>
+              <w:rPr>
+                <w:b/>
+              </w:rPr>
+              <w:t>EvaluationLocalMapper / RemoteMapper</w:t>
+            </w:r>
+          </w:p>
+        </w:tc>
+        <w:tc>
+          <w:tcPr>
+            <w:tcW w:type="dxa" w:w="3120"/>
+            <w:tcBorders>
+              <w:top w:val="none"/>
+              <w:bottom w:val="single" w:sz="12" w:space="0" w:color="000000"/>
+              <w:left w:val="none"/>
+              <w:right w:val="none"/>
+            </w:tcBorders>
+            <w:tcMar>
+              <w:top w:w="70" w:type="dxa"/>
+              <w:bottom w:w="70" w:type="dxa"/>
+              <w:left w:w="100" w:type="dxa"/>
+              <w:right w:w="100" w:type="dxa"/>
+            </w:tcMar>
+          </w:tcPr>
+          <w:p>
+            <w:r>
+              <w:t>Data Mappers</w:t>
+            </w:r>
+          </w:p>
+        </w:tc>
+        <w:tc>
+          <w:tcPr>
+            <w:tcW w:type="dxa" w:w="3120"/>
+            <w:tcBorders>
+              <w:top w:val="none"/>
+              <w:bottom w:val="single" w:sz="12" w:space="0" w:color="000000"/>
+              <w:left w:val="none"/>
+              <w:right w:val="none"/>
+            </w:tcBorders>
+            <w:tcMar>
+              <w:top w:w="70" w:type="dxa"/>
+              <w:bottom w:w="70" w:type="dxa"/>
+              <w:left w:w="100" w:type="dxa"/>
+              <w:right w:w="100" w:type="dxa"/>
+            </w:tcMar>
+          </w:tcPr>
+          <w:p>
+            <w:r>
+              <w:t>Clases puras de transformación bidireccional entre la entidad rica del dominio y los registros físicos planos de cada base de datos.</w:t>
+            </w:r>
+          </w:p>
+        </w:tc>
+      </w:tr>
+    </w:tbl>
+    <w:p>
+      <w:pPr>
+        <w:spacing w:before="200" w:after="80" w:line="360" w:lineRule="auto"/>
+        <w:jc w:val="left"/>
+      </w:pPr>
+      <w:r>
+        <w:rPr>
+          <w:rFonts w:ascii="Times New Roman" w:hAnsi="Times New Roman"/>
+          <w:b/>
+          <w:i/>
+          <w:sz w:val="24"/>
+        </w:rPr>
+        <w:t>3. Análisis de Relaciones</w:t>
+      </w:r>
+    </w:p>
+    <w:p>
+      <w:pPr>
+        <w:spacing w:line="360" w:lineRule="auto" w:after="120" w:before="0"/>
+        <w:jc w:val="left"/>
+      </w:pPr>
+      <w:r>
+        <w:rPr>
+          <w:rFonts w:ascii="Times New Roman" w:hAnsi="Times New Roman"/>
+          <w:b w:val="0"/>
+          <w:i w:val="0"/>
+          <w:sz w:val="24"/>
+        </w:rPr>
+        <w:t>• Desacoplamiento por Mappers: Las entidades de negocio no importan SDKs de Firestore ni librerías de IndexedDB. Toda traducción se aísla en los mappers.</w:t>
         <w:br/>
-        <w:t>• Schema Cloud Firestore (FirestoreEvaluationDocument y Subcolección): Se modela como documento padre en /evaluaciones/{id} con una subcolección anidada /preguntas/{qId}. Esto permite a los docentes ejecutar consultas analíticas sobre reactivos específicos sin descargar exámenes completos, optimizando la cuota de lecturas facturables de Firestore.</w:t>
+        <w:t>• Composición NoSQL (`FirestoreEvaluationDocument *-- FirestoreQuestionSubdocument`): Representa una subcolección en Firestore. Permite a los docentes auditar reactivos específicos sin incurrir en lecturas masivas de documentos completos.</w:t>
+      </w:r>
+    </w:p>
+    <w:p>
+      <w:pPr>
+        <w:spacing w:before="200" w:after="80" w:line="360" w:lineRule="auto"/>
+        <w:jc w:val="left"/>
+      </w:pPr>
+      <w:r>
+        <w:rPr>
+          <w:rFonts w:ascii="Times New Roman" w:hAnsi="Times New Roman"/>
+          <w:b/>
+          <w:i/>
+          <w:sz w:val="24"/>
+        </w:rPr>
+        <w:t>4. Resolución de Conflictos e Integridad</w:t>
+      </w:r>
+    </w:p>
+    <w:p>
+      <w:pPr>
+        <w:spacing w:line="360" w:lineRule="auto" w:after="120" w:before="0"/>
+        <w:jc w:val="left"/>
+      </w:pPr>
+      <w:r>
+        <w:rPr>
+          <w:rFonts w:ascii="Times New Roman" w:hAnsi="Times New Roman"/>
+          <w:b w:val="0"/>
+          <w:i w:val="0"/>
+          <w:sz w:val="24"/>
+        </w:rPr>
+        <w:t>El repositorio unificado implementa la regla de Última Escritura Gana (Last-Write-Wins), comparando las marcas temporales locales con el `server_timestamp` emitido por Firestore para resolver colisiones al restablecer la conexión.</w:t>
+      </w:r>
+    </w:p>
+    <w:p>
+      <w:pPr>
+        <w:spacing w:before="200" w:after="80" w:line="360" w:lineRule="auto"/>
+        <w:jc w:val="left"/>
+      </w:pPr>
+      <w:r>
+        <w:rPr>
+          <w:rFonts w:ascii="Times New Roman" w:hAnsi="Times New Roman"/>
+          <w:b/>
+          <w:i/>
+          <w:sz w:val="24"/>
+        </w:rPr>
+        <w:t>5. Guía de Evaluación Oral</w:t>
+      </w:r>
+    </w:p>
+    <w:p>
+      <w:pPr>
+        <w:spacing w:line="360" w:lineRule="auto" w:after="120" w:before="0"/>
+        <w:jc w:val="left"/>
+      </w:pPr>
+      <w:r>
+        <w:rPr>
+          <w:rFonts w:ascii="Times New Roman" w:hAnsi="Times New Roman"/>
+          <w:b w:val="0"/>
+          <w:i w:val="0"/>
+          <w:sz w:val="24"/>
+        </w:rPr>
+        <w:t>• Pregunta: ¿Cómo se manejan los diagramas de clases estructurales cuando el sistema tiene múltiples bases de datos?</w:t>
         <w:br/>
-        <w:t>• Patrón Data Mapper: Desacopla la lógica de negocio de las APIs de Google y del navegador. La entidad Evaluation del dominio es completamente agnóstica de IndexedDB y Firestore.</w:t>
+        <w:t xml:space="preserve">  Respuesta: Se desacoplan en tres niveles: (1) Entidades de Negocio puras; (2) Schemas Físicos específicos para cada base de datos (ObjectStores en IndexedDB y Colecciones/Subcolecciones en Firestore); y (3) Data Mappers que convierten entre el dominio y cada schema, coordinados por un Repositorio Unificado que oculta la complejidad multibase al resto del sistema.</w:t>
       </w:r>
     </w:p>
     <w:p>
@@ -1407,7 +2491,7 @@
           <w:b/>
           <w:sz w:val="28"/>
         </w:rPr>
-        <w:t>CAPÍTULO V: MODELO CONCEPTUAL Y RELACIONAL DE DATOS (ERD)</w:t>
+        <w:t>CAPÍTULO V: DIAGRAMA 4 — MODELO ENTIDAD-RELACIÓN (ERD) Y TAXONOMÍA</w:t>
       </w:r>
     </w:p>
     <w:p>
@@ -1421,37 +2505,7 @@
           <w:b/>
           <w:sz w:val="26"/>
         </w:rPr>
-        <w:t>5.1 Diagrama Entidad-Relación de 10 Entidades (Diagrama 4)</w:t>
-      </w:r>
-    </w:p>
-    <w:p>
-      <w:pPr>
-        <w:spacing w:line="360" w:lineRule="auto" w:after="120" w:before="0"/>
-        <w:jc w:val="left"/>
-      </w:pPr>
-      <w:r>
-        <w:rPr>
-          <w:rFonts w:ascii="Times New Roman" w:hAnsi="Times New Roman"/>
-          <w:b w:val="0"/>
-          <w:i w:val="0"/>
-          <w:sz w:val="24"/>
-        </w:rPr>
-        <w:t>El Diagrama Entidad-Relación formaliza las 10 entidades del dominio de YAPU, estableciendo los tipos de datos normalizados, las restricciones de integridad referencial y las reglas de propagación de eliminaciones.</w:t>
-      </w:r>
-    </w:p>
-    <w:p>
-      <w:pPr>
-        <w:spacing w:before="200" w:after="80" w:line="360" w:lineRule="auto"/>
-        <w:jc w:val="left"/>
-      </w:pPr>
-      <w:r>
-        <w:rPr>
-          <w:rFonts w:ascii="Times New Roman" w:hAnsi="Times New Roman"/>
-          <w:b/>
-          <w:i/>
-          <w:sz w:val="24"/>
-        </w:rPr>
-        <w:t>Código Mermaid del Diagrama 4: ERD</w:t>
+        <w:t>5.1 Representación del Diagrama Entidad-Relación (Mermaid)</w:t>
       </w:r>
     </w:p>
     <w:p>
@@ -1524,11 +2578,11 @@
           <w:i w:val="0"/>
           <w:sz w:val="24"/>
         </w:rPr>
-        <w:t>1. Relaciones Fuertes (Existencia Independiente): USUARIO a ORACION_BASE (asociación independiente de autor y validador) y NIVEL a PALABRA_VOCABULARIO (catálogo curricular). Si un docente es desactivado, las oraciones certificadas permanecen intactas.</w:t>
+        <w:t>1. Relaciones Fuertes (Existencia Independiente): USUARIO a ORACION_BASE (doble asociación de autor y validador) y NIVEL a PALABRA_VOCABULARIO (catálogo léxico A1). Si un docente se retira, las oraciones aprobadas permanecen intactas en el banco histórico.</w:t>
         <w:br/>
-        <w:t>2. Relaciones Débiles por Existencia: USUARIO a PERFIL_ESTUDIANTE (1:0..1). Si un estudiante solicita el borrado de su cuenta (Habeas Data boliviano), su perfil académico se purga en cascada (ON DELETE CASCADE).</w:t>
+        <w:t>2. Relaciones Débiles por Existencia: USUARIO a PERFIL_ESTUDIANTE (1:0..1). Si un estudiante ejerce su derecho legal de supresión de datos (Habeas Data boliviano), su perfil académico se elimina en cascada.</w:t>
         <w:br/>
-        <w:t>3. Relaciones Débiles por Identificación: EVALUACION a DETALLE_PREGUNTA (composición pura 1:10) y PROGRESO_NIVEL (tabla asociativa con clave compuesta única id_estudiante + id_nivel).</w:t>
+        <w:t>3. Relaciones Débiles por Identificación: EVALUACION a DETALLE_PREGUNTA (composición pura 1:10) y PROGRESO_NIVEL (tabla asociativa N:M con clave primaria compuesta única id_estudiante + id_nivel).</w:t>
       </w:r>
     </w:p>
     <w:p>
@@ -1591,9 +2645,9 @@
           <w:i w:val="0"/>
           <w:sz w:val="24"/>
         </w:rPr>
-        <w:t>• Relaciones «include» Obligatorias: Registrar Cuenta incluye obligatoriamente Verificar Token Correo; Modo Offline incluye Sincronizar Progreso al Reconectar; Gestionar Oraciones y Proponer Retos incluyen Doble Validación Docente.</w:t>
+        <w:t>• Relaciones «include» Obligatorias: Registrar Cuenta incluye Verificar Token Correo; Modo Offline incluye Sincronizar Progreso al Reconectar; Gestionar Oraciones y Proponer Retos incluyen Doble Validación Docente.</w:t>
         <w:br/>
-        <w:t>• Relación «extend» Condicional: Rendir Evaluación extiende a Desbloquear Siguiente Nivel si y solo si la calificación obtenida cumple la condición de guarda [calificación &gt;= 70%].</w:t>
+        <w:t>• Relación «extend» Condicional: Rendir Evaluación extiende a Desbloquear Siguiente Nivel si y solo si la nota obtenida cumple la condición de guarda obligatoria [calificación &gt;= 70%].</w:t>
       </w:r>
     </w:p>
     <w:p>
@@ -1607,7 +2661,7 @@
           <w:b/>
           <w:sz w:val="26"/>
         </w:rPr>
-        <w:t>6.2 Motor de IA Determinista vs. LLMs Comerciales (Diagrama 6.1)</w:t>
+        <w:t>6.2 Motor de IA Determinista vs. LLMs Comerciales (Diagrama 6.1 y 9.1)</w:t>
       </w:r>
     </w:p>
     <w:p>
@@ -1622,7 +2676,7 @@
           <w:i w:val="0"/>
           <w:sz w:val="24"/>
         </w:rPr>
-        <w:t>El generador algorítmico local en TypeScript opera sin invocar APIs externas de OpenAI o Anthropic. Ejecuta un autómata que descompone oraciones base en componentes sintácticos (Sujeto, Objeto, Verbo), aplica sufijos aglutinantes controlados (-pi, -man, -manta) y extrae 3 distractores del mismo campo semántico mediante el algoritmo Fisher-Yates. Esto garantiza coste cero ($0 en facturación mensual), respuesta en menos de 50 milisegundos y cero alucinaciones lingüísticas.</w:t>
+        <w:t>El motor determinista local en TypeScript ejecuta un autómata que descompone oraciones base en componentes sintácticos (Sujeto, Objeto, Verbo), aplica sufijos aglutinantes quechuas controlados (-pi, -man, -manta) y extrae 3 distractores del mismo campo semántico mediante Fisher-Yates Shuffle. Esto garantiza coste cero ($0 en APIs), ejecución offline en smartphones rurales y cero alucinaciones gramaticales.</w:t>
       </w:r>
     </w:p>
     <w:p>
@@ -1636,7 +2690,7 @@
           <w:b/>
           <w:sz w:val="26"/>
         </w:rPr>
-        <w:t>6.3 Protocolo de Doble Moderación Lingüística (Diagrama 6.2)</w:t>
+        <w:t>6.3 Protocolo de Doble Moderación y Principio de Cuatro Ojos (Diagrama 6.2)</w:t>
       </w:r>
     </w:p>
     <w:p>
@@ -1651,7 +2705,7 @@
           <w:i w:val="0"/>
           <w:sz w:val="24"/>
         </w:rPr>
-        <w:t>Aplica el principio de los cuatro ojos: ningún docente puede certificar sus propias oraciones base (autor_id != validador_id). Todo aporte comunitario entra en cuarentena en estado 'pendiente' hasta que un segundo docente hablante certificado valida la ortografía normalizada y la pertinencia etnográfica del contexto cultural.</w:t>
+        <w:t>Aplica la regla inviolable autor_id != validador_id. Ningún docente puede certificar sus propios reactivos pedagógicos. Todo aporte queda en estado 'pendiente' hasta que un segundo docente certificado valida la ortografía Collao y el contexto cultural etnográfico.</w:t>
       </w:r>
     </w:p>
     <w:p>
@@ -1699,7 +2753,7 @@
           <w:i w:val="0"/>
           <w:sz w:val="24"/>
         </w:rPr>
-        <w:t>Modela el ordenamiento temporal a lo largo de 5 fases críticas: (1) Carga inicial y validación de App Shell en Cache Storage; (2) Exploración curricular y estudio léxico; (3) Generación y corrección de evaluación determinista local; (4) Bifurcación de persistencia según conectividad (escritura inmediata en IndexedDB); y (5) Sincronización asíncrona en segundo plano (Background Sync) con vaciado de cola en lote (Batch Write) al reconectar a internet.</w:t>
+        <w:t>Modela el ordenamiento temporal a lo largo de 5 fases: (1) Carga inicial de App Shell desde Cache Storage; (2) Práctica léxica interactiva; (3) Generación y corrección de examen en local (&lt; 50 ms); (4) Persistencia inmediata en IndexedDB; y (5) Sincronización asíncrona en segundo plano (Background Sync) con vaciado de lotes (Batch Write) hacia Cloud Firestore al recuperar conectividad.</w:t>
       </w:r>
     </w:p>
     <w:p>
@@ -1728,7 +2782,7 @@
           <w:i w:val="0"/>
           <w:sz w:val="24"/>
         </w:rPr>
-        <w:t>Modela los estados válidos de la sesión: VerificandoConectividad, DashboardActivo, NivelBloqueado (candado visual si nota previa &lt; 70%), NivelHabilitado, EvaluacionDeterminista y PersistenciaProgreso (con estados EncoladoLocalIndexedDB y EsperandoReconexion).</w:t>
+        <w:t>Modela el ciclo de vida del estudiante: VerificandoConectividad, DashboardActivo, NivelBloqueado (candado visual si nota previa &lt; 70%), NivelHabilitado, EvaluacionDeterminista y PersistenciaProgreso (con bifurcación entre GuardadoInmediatoFirestore y EncoladoLocalIndexedDB).</w:t>
       </w:r>
     </w:p>
     <w:p>
@@ -1757,9 +2811,9 @@
           <w:i w:val="0"/>
           <w:sz w:val="24"/>
         </w:rPr>
-        <w:t>• Actividad A (Generación de Reactivos): Flujo con validación cruzada de categoría gramatical para distractores.</w:t>
+        <w:t>• Actividad A (Generador de Preguntas): Selección pseudoaleatoria con semilla, permutación de marcas de caso y filtro estricto de distractores.</w:t>
         <w:br/>
-        <w:t>• Actividad B (Resiliencia Offline-First): Interceptación del Service Worker, almacenamiento no bloqueante en IndexedDB y vaciado transparente mediante SyncManager.</w:t>
+        <w:t>• Actividad B (Resiliencia Offline-First): Interceptación del Service Worker, almacenamiento no bloqueante en IndexedDB y vaciado atómico vía SyncManager.</w:t>
       </w:r>
     </w:p>
     <w:p>
@@ -1778,7 +2832,7 @@
           <w:b/>
           <w:sz w:val="28"/>
         </w:rPr>
-        <w:t>CAPÍTULO VIII: MATRIZ DE GOBERNANZA Y AUDITORÍA DE IA (UPDS)</w:t>
+        <w:t>CAPÍTULO VIII: MATRIZ DE AUDITORÍA Y GOBERNANZA DE IA (UPDS)</w:t>
       </w:r>
     </w:p>
     <w:p>
@@ -1793,7 +2847,7 @@
           <w:i w:val="0"/>
           <w:sz w:val="24"/>
         </w:rPr>
-        <w:t>En cumplimiento de las normativas éticas de la Universidad Privada Domingo Savio, esta sección documenta las intervenciones críticas donde el equipo humano modificó o descartó propuestas de IA generativa para garantizar la viabilidad del proyecto:</w:t>
+        <w:t>En cumplimiento de la normativa de integridad académica de la Universidad Privada Domingo Savio (Sede Santa Cruz), se documenta de forma transparente y verificable cómo se emplearon herramientas de Inteligencia Artificial en el diseño de este álbum de modelos, detallando las decisiones aceptadas, modificadas y rechazadas por el equipo humano:</w:t>
       </w:r>
     </w:p>
     <w:tbl>
@@ -1830,7 +2884,7 @@
               <w:rPr>
                 <w:b/>
               </w:rPr>
-              <w:t>ID</w:t>
+              <w:t>Artefacto / Componente</w:t>
             </w:r>
           </w:p>
         </w:tc>
@@ -1855,7 +2909,7 @@
               <w:rPr>
                 <w:b/>
               </w:rPr>
-              <w:t>Componente</w:t>
+              <w:t>Herramienta y Contenido Asistido por IA</w:t>
             </w:r>
           </w:p>
         </w:tc>
@@ -1880,7 +2934,7 @@
               <w:rPr>
                 <w:b/>
               </w:rPr>
-              <w:t>Propuesta Asistida por IA</w:t>
+              <w:t>Aceptado o Modificado por el Equipo</w:t>
             </w:r>
           </w:p>
         </w:tc>
@@ -1905,7 +2959,7 @@
               <w:rPr>
                 <w:b/>
               </w:rPr>
-              <w:t>Ajuste Crítico Humano (Equipo UPDS)</w:t>
+              <w:t>Rechazado Expresamente (Qué y Por Qué)</w:t>
             </w:r>
           </w:p>
         </w:tc>
@@ -1932,7 +2986,7 @@
               <w:rPr>
                 <w:b/>
               </w:rPr>
-              <w:t>AUD-01</w:t>
+              <w:t>Diagrama 1: Arquitectura General (PWA + Firebase)</w:t>
             </w:r>
           </w:p>
         </w:tc>
@@ -1954,7 +3008,7 @@
           </w:tcPr>
           <w:p>
             <w:r>
-              <w:t>Motor de IA (RF-005)</w:t>
+              <w:t>Claude / Gemini: Sugirió arquitectura cliente-servidor con integración de API externa comercial de OpenAI para generar exámenes.</w:t>
             </w:r>
           </w:p>
         </w:tc>
@@ -1976,7 +3030,7 @@
           </w:tcPr>
           <w:p>
             <w:r>
-              <w:t>API comercial externa de OpenAI/Gemini</w:t>
+              <w:t>Modificado: Se adoptó Astro SSG + Service Worker e IndexedDB para garantizar consumo RAM &lt; 150MB y FCP &lt; 1.8s.</w:t>
             </w:r>
           </w:p>
         </w:tc>
@@ -2001,7 +3055,7 @@
               <w:rPr>
                 <w:b/>
               </w:rPr>
-              <w:t>Descarte total. Motor determinista local en TypeScript ($0 y offline).</w:t>
+              <w:t>Rechazado: Conexión externa a LLMs comerciales. Inviable por coste de API ($0 en SRS 3.3) y dependencia de internet continuo en áreas rurales.</w:t>
             </w:r>
           </w:p>
         </w:tc>
@@ -2028,7 +3082,7 @@
               <w:rPr>
                 <w:b/>
               </w:rPr>
-              <w:t>AUD-02</w:t>
+              <w:t>Diagrama 2: Clases del Dominio Pedagógico</w:t>
             </w:r>
           </w:p>
         </w:tc>
@@ -2050,7 +3104,7 @@
           </w:tcPr>
           <w:p>
             <w:r>
-              <w:t>Casos de Uso (RF-003)</w:t>
+              <w:t>Asistente de IA: Propuso clases monolíticas acopladas con generación directa de texto en lenguaje natural.</w:t>
             </w:r>
           </w:p>
         </w:tc>
@@ -2072,7 +3126,7 @@
           </w:tcPr>
           <w:p>
             <w:r>
-              <w:t>Umbral del 50% o lectura lineal simple</w:t>
+              <w:t>Modificado: Se aplicó Inversión de Dependencias (IEvaluationEngine) y composición pura de Question dentro de Evaluation.</w:t>
             </w:r>
           </w:p>
         </w:tc>
@@ -2097,7 +3151,7 @@
               <w:rPr>
                 <w:b/>
               </w:rPr>
-              <w:t>Umbral estricto del 70% validado con docente titular.</w:t>
+              <w:t>Rechazado: Instanciación directa de motores concretos; violaba el principio SOLID de inversión de dependencias para testing con Mocks.</w:t>
             </w:r>
           </w:p>
         </w:tc>
@@ -2124,7 +3178,7 @@
               <w:rPr>
                 <w:b/>
               </w:rPr>
-              <w:t>AUD-03</w:t>
+              <w:t>Diagrama 3: Persistencia Multibase de Datos</w:t>
             </w:r>
           </w:p>
         </w:tc>
@@ -2146,7 +3200,7 @@
           </w:tcPr>
           <w:p>
             <w:r>
-              <w:t>Retos Comunitarios (RF-007)</w:t>
+              <w:t>Asistente de IA: Propuso usar una sola base de datos relacional MySQL tradicional sin soporte offline.</w:t>
             </w:r>
           </w:p>
         </w:tc>
@@ -2168,7 +3222,7 @@
           </w:tcPr>
           <w:p>
             <w:r>
-              <w:t>Votación popular abierta tipo Reddit</w:t>
+              <w:t>Modificado: Se diseñó persistencia dual: IndexedDB local con schemas indexados y Cloud Firestore NoSQL remota, vinculados por Data Mappers.</w:t>
             </w:r>
           </w:p>
         </w:tc>
@@ -2193,7 +3247,7 @@
               <w:rPr>
                 <w:b/>
               </w:rPr>
-              <w:t>Doble validación docente (4 ojos) con cuarentena obligatoria.</w:t>
+              <w:t>Rechazado: Forzar un único motor de base de datos; incapacitaba el funcionamiento offline-first en smartphones sin señal de red.</w:t>
             </w:r>
           </w:p>
         </w:tc>
@@ -2220,7 +3274,7 @@
               <w:rPr>
                 <w:b/>
               </w:rPr>
-              <w:t>AUD-04</w:t>
+              <w:t>Diagrama 5 y 6: Casos de Uso y Moderación</w:t>
             </w:r>
           </w:p>
         </w:tc>
@@ -2242,7 +3296,7 @@
           </w:tcPr>
           <w:p>
             <w:r>
-              <w:t>Distractores Léxicos</w:t>
+              <w:t>Asistente de IA: Propuso umbral de avance al 50% y moderación por votos comunitarios abiertos estilo foro (Reddit).</w:t>
             </w:r>
           </w:p>
         </w:tc>
@@ -2264,7 +3318,7 @@
           </w:tcPr>
           <w:p>
             <w:r>
-              <w:t>Selección aleatoria del diccionario global</w:t>
+              <w:t>Modificado: Umbral del 70% obligatorio e instauración del principio de cuatro ojos (autor_id != validador_id) con cuarentena.</w:t>
             </w:r>
           </w:p>
         </w:tc>
@@ -2289,295 +3343,7 @@
               <w:rPr>
                 <w:b/>
               </w:rPr>
-              <w:t>Filtro semántico estricto: misma categoría gramatical y nivel.</w:t>
-            </w:r>
-          </w:p>
-        </w:tc>
-      </w:tr>
-      <w:tr>
-        <w:tc>
-          <w:tcPr>
-            <w:tcW w:type="dxa" w:w="2340"/>
-            <w:tcBorders>
-              <w:top w:val="none"/>
-              <w:bottom w:val="none"/>
-              <w:left w:val="none"/>
-              <w:right w:val="none"/>
-            </w:tcBorders>
-            <w:tcMar>
-              <w:top w:w="70" w:type="dxa"/>
-              <w:bottom w:w="70" w:type="dxa"/>
-              <w:left w:w="100" w:type="dxa"/>
-              <w:right w:w="100" w:type="dxa"/>
-            </w:tcMar>
-          </w:tcPr>
-          <w:p>
-            <w:r>
-              <w:rPr>
-                <w:b/>
-              </w:rPr>
-              <w:t>AUD-05</w:t>
-            </w:r>
-          </w:p>
-        </w:tc>
-        <w:tc>
-          <w:tcPr>
-            <w:tcW w:type="dxa" w:w="2340"/>
-            <w:tcBorders>
-              <w:top w:val="none"/>
-              <w:bottom w:val="none"/>
-              <w:left w:val="none"/>
-              <w:right w:val="none"/>
-            </w:tcBorders>
-            <w:tcMar>
-              <w:top w:w="70" w:type="dxa"/>
-              <w:bottom w:w="70" w:type="dxa"/>
-              <w:left w:w="100" w:type="dxa"/>
-              <w:right w:w="100" w:type="dxa"/>
-            </w:tcMar>
-          </w:tcPr>
-          <w:p>
-            <w:r>
-              <w:t>Persistencia (ERD)</w:t>
-            </w:r>
-          </w:p>
-        </w:tc>
-        <w:tc>
-          <w:tcPr>
-            <w:tcW w:type="dxa" w:w="2340"/>
-            <w:tcBorders>
-              <w:top w:val="none"/>
-              <w:bottom w:val="none"/>
-              <w:left w:val="none"/>
-              <w:right w:val="none"/>
-            </w:tcBorders>
-            <w:tcMar>
-              <w:top w:w="70" w:type="dxa"/>
-              <w:bottom w:w="70" w:type="dxa"/>
-              <w:left w:w="100" w:type="dxa"/>
-              <w:right w:w="100" w:type="dxa"/>
-            </w:tcMar>
-          </w:tcPr>
-          <w:p>
-            <w:r>
-              <w:t>Relación simple Usuario 1:N OracionBase</w:t>
-            </w:r>
-          </w:p>
-        </w:tc>
-        <w:tc>
-          <w:tcPr>
-            <w:tcW w:type="dxa" w:w="2340"/>
-            <w:tcBorders>
-              <w:top w:val="none"/>
-              <w:bottom w:val="none"/>
-              <w:left w:val="none"/>
-              <w:right w:val="none"/>
-            </w:tcBorders>
-            <w:tcMar>
-              <w:top w:w="70" w:type="dxa"/>
-              <w:bottom w:w="70" w:type="dxa"/>
-              <w:left w:w="100" w:type="dxa"/>
-              <w:right w:w="100" w:type="dxa"/>
-            </w:tcMar>
-          </w:tcPr>
-          <w:p>
-            <w:r>
-              <w:rPr>
-                <w:b/>
-              </w:rPr>
-              <w:t>Doble relación independiente: autor_id != validador_id.</w:t>
-            </w:r>
-          </w:p>
-        </w:tc>
-      </w:tr>
-      <w:tr>
-        <w:tc>
-          <w:tcPr>
-            <w:tcW w:type="dxa" w:w="2340"/>
-            <w:tcBorders>
-              <w:top w:val="none"/>
-              <w:bottom w:val="none"/>
-              <w:left w:val="none"/>
-              <w:right w:val="none"/>
-            </w:tcBorders>
-            <w:tcMar>
-              <w:top w:w="70" w:type="dxa"/>
-              <w:bottom w:w="70" w:type="dxa"/>
-              <w:left w:w="100" w:type="dxa"/>
-              <w:right w:w="100" w:type="dxa"/>
-            </w:tcMar>
-          </w:tcPr>
-          <w:p>
-            <w:r>
-              <w:rPr>
-                <w:b/>
-              </w:rPr>
-              <w:t>AUD-06</w:t>
-            </w:r>
-          </w:p>
-        </w:tc>
-        <w:tc>
-          <w:tcPr>
-            <w:tcW w:type="dxa" w:w="2340"/>
-            <w:tcBorders>
-              <w:top w:val="none"/>
-              <w:bottom w:val="none"/>
-              <w:left w:val="none"/>
-              <w:right w:val="none"/>
-            </w:tcBorders>
-            <w:tcMar>
-              <w:top w:w="70" w:type="dxa"/>
-              <w:bottom w:w="70" w:type="dxa"/>
-              <w:left w:w="100" w:type="dxa"/>
-              <w:right w:w="100" w:type="dxa"/>
-            </w:tcMar>
-          </w:tcPr>
-          <w:p>
-            <w:r>
-              <w:t>Detalle de Preguntas</w:t>
-            </w:r>
-          </w:p>
-        </w:tc>
-        <w:tc>
-          <w:tcPr>
-            <w:tcW w:type="dxa" w:w="2340"/>
-            <w:tcBorders>
-              <w:top w:val="none"/>
-              <w:bottom w:val="none"/>
-              <w:left w:val="none"/>
-              <w:right w:val="none"/>
-            </w:tcBorders>
-            <w:tcMar>
-              <w:top w:w="70" w:type="dxa"/>
-              <w:bottom w:w="70" w:type="dxa"/>
-              <w:left w:w="100" w:type="dxa"/>
-              <w:right w:w="100" w:type="dxa"/>
-            </w:tcMar>
-          </w:tcPr>
-          <w:p>
-            <w:r>
-              <w:t>JSON no estructurado en tabla evaluación</w:t>
-            </w:r>
-          </w:p>
-        </w:tc>
-        <w:tc>
-          <w:tcPr>
-            <w:tcW w:type="dxa" w:w="2340"/>
-            <w:tcBorders>
-              <w:top w:val="none"/>
-              <w:bottom w:val="none"/>
-              <w:left w:val="none"/>
-              <w:right w:val="none"/>
-            </w:tcBorders>
-            <w:tcMar>
-              <w:top w:w="70" w:type="dxa"/>
-              <w:bottom w:w="70" w:type="dxa"/>
-              <w:left w:w="100" w:type="dxa"/>
-              <w:right w:w="100" w:type="dxa"/>
-            </w:tcMar>
-          </w:tcPr>
-          <w:p>
-            <w:r>
-              <w:rPr>
-                <w:b/>
-              </w:rPr>
-              <w:t>Entidad débil DETALLE_PREGUNTA 1:10 normalizada para analítica.</w:t>
-            </w:r>
-          </w:p>
-        </w:tc>
-      </w:tr>
-      <w:tr>
-        <w:tc>
-          <w:tcPr>
-            <w:tcW w:type="dxa" w:w="2340"/>
-            <w:tcBorders>
-              <w:top w:val="none"/>
-              <w:bottom w:val="none"/>
-              <w:left w:val="none"/>
-              <w:right w:val="none"/>
-            </w:tcBorders>
-            <w:tcMar>
-              <w:top w:w="70" w:type="dxa"/>
-              <w:bottom w:w="70" w:type="dxa"/>
-              <w:left w:w="100" w:type="dxa"/>
-              <w:right w:w="100" w:type="dxa"/>
-            </w:tcMar>
-          </w:tcPr>
-          <w:p>
-            <w:r>
-              <w:rPr>
-                <w:b/>
-              </w:rPr>
-              <w:t>AUD-07</w:t>
-            </w:r>
-          </w:p>
-        </w:tc>
-        <w:tc>
-          <w:tcPr>
-            <w:tcW w:type="dxa" w:w="2340"/>
-            <w:tcBorders>
-              <w:top w:val="none"/>
-              <w:bottom w:val="none"/>
-              <w:left w:val="none"/>
-              <w:right w:val="none"/>
-            </w:tcBorders>
-            <w:tcMar>
-              <w:top w:w="70" w:type="dxa"/>
-              <w:bottom w:w="70" w:type="dxa"/>
-              <w:left w:w="100" w:type="dxa"/>
-              <w:right w:w="100" w:type="dxa"/>
-            </w:tcMar>
-          </w:tcPr>
-          <w:p>
-            <w:r>
-              <w:t>Capa Presentación (RF-010)</w:t>
-            </w:r>
-          </w:p>
-        </w:tc>
-        <w:tc>
-          <w:tcPr>
-            <w:tcW w:type="dxa" w:w="2340"/>
-            <w:tcBorders>
-              <w:top w:val="none"/>
-              <w:bottom w:val="none"/>
-              <w:left w:val="none"/>
-              <w:right w:val="none"/>
-            </w:tcBorders>
-            <w:tcMar>
-              <w:top w:w="70" w:type="dxa"/>
-              <w:bottom w:w="70" w:type="dxa"/>
-              <w:left w:w="100" w:type="dxa"/>
-              <w:right w:w="100" w:type="dxa"/>
-            </w:tcMar>
-          </w:tcPr>
-          <w:p>
-            <w:r>
-              <w:t>SPA tradicional en React con Tailwind</w:t>
-            </w:r>
-          </w:p>
-        </w:tc>
-        <w:tc>
-          <w:tcPr>
-            <w:tcW w:type="dxa" w:w="2340"/>
-            <w:tcBorders>
-              <w:top w:val="none"/>
-              <w:bottom w:val="none"/>
-              <w:left w:val="none"/>
-              <w:right w:val="none"/>
-            </w:tcBorders>
-            <w:tcMar>
-              <w:top w:w="70" w:type="dxa"/>
-              <w:bottom w:w="70" w:type="dxa"/>
-              <w:left w:w="100" w:type="dxa"/>
-              <w:right w:w="100" w:type="dxa"/>
-            </w:tcMar>
-          </w:tcPr>
-          <w:p>
-            <w:r>
-              <w:rPr>
-                <w:b/>
-              </w:rPr>
-              <w:t>Astro SSG + Islands. Consumo RAM &lt; 150MB para gama de entrada.</w:t>
+              <w:t>Rechazado: Votación comunitaria sin filtro docente. Habría contaminado el banco lingüístico con interferencias del castellano o aymara.</w:t>
             </w:r>
           </w:p>
         </w:tc>
@@ -2604,7 +3370,7 @@
               <w:rPr>
                 <w:b/>
               </w:rPr>
-              <w:t>AUD-08</w:t>
+              <w:t>Diagrama 4: Modelo Entidad-Relación (ERD)</w:t>
             </w:r>
           </w:p>
         </w:tc>
@@ -2626,7 +3392,7 @@
           </w:tcPr>
           <w:p>
             <w:r>
-              <w:t>Contexto Lingüístico</w:t>
+              <w:t>Asistente de IA: Propuso guardar las preguntas de evaluación como un texto JSON no estructurado dentro de la tabla de usuarios.</w:t>
             </w:r>
           </w:p>
         </w:tc>
@@ -2648,7 +3414,7 @@
           </w:tcPr>
           <w:p>
             <w:r>
-              <w:t>Solo palabra quechua y traducción</w:t>
+              <w:t>Modificado: Se normalizó la entidad débil DETALLE_PREGUNTA con cardinalidad 1:10 y claves foráneas tipadas.</w:t>
             </w:r>
           </w:p>
         </w:tc>
@@ -2673,12 +3439,70 @@
               <w:rPr>
                 <w:b/>
               </w:rPr>
-              <w:t>Campo obligatorio contexto_cultural etnográfico andino.</w:t>
+              <w:t>Rechazado: Almacenamiento desnormalizado sin clave foránea; impedía la auditoría analítica de errores morfológicos por nivel.</w:t>
             </w:r>
           </w:p>
         </w:tc>
       </w:tr>
     </w:tbl>
+    <w:p>
+      <w:pPr>
+        <w:spacing w:before="280" w:after="120" w:line="360" w:lineRule="auto"/>
+        <w:jc w:val="left"/>
+      </w:pPr>
+      <w:r>
+        <w:rPr>
+          <w:rFonts w:ascii="Times New Roman" w:hAnsi="Times New Roman"/>
+          <w:b/>
+          <w:sz w:val="26"/>
+        </w:rPr>
+        <w:t>8.1 Evidencia de Mejora del Prompt</w:t>
+      </w:r>
+    </w:p>
+    <w:p>
+      <w:pPr>
+        <w:spacing w:line="360" w:lineRule="auto" w:after="120" w:before="0"/>
+        <w:jc w:val="left"/>
+      </w:pPr>
+      <w:r>
+        <w:rPr>
+          <w:rFonts w:ascii="Times New Roman" w:hAnsi="Times New Roman"/>
+          <w:b w:val="0"/>
+          <w:i w:val="0"/>
+          <w:sz w:val="24"/>
+        </w:rPr>
+        <w:t>La interacción inicial con la IA partió de solicitudes abiertas de modelado UML genérico. El equipo detectó tempranamente que la IA tendía a proponer stacks de software convencionales pensados para entornos empresariales con conectividad de fibra óptica y presupuestos comerciales holgados (APIs de OpenAI, bases de datos SQL centralizadas, SPAs pesadas en React). Mediante refinamiento iterativo de prompts (*prompt engineering*), el equipo humano restringió el contexto incorporando las directrices de la stakeholder pedagógica (Lic. María Elena Quispe), la realidad técnica de las redes 2G/3G en Sucre y las restricciones formales de presupuesto ($0) y memoria (&lt; 150 MB RAM). Este proceso documenta el gobierno humano sobre los artefactos de software generados.</w:t>
+      </w:r>
+    </w:p>
+    <w:p>
+      <w:pPr>
+        <w:spacing w:before="280" w:after="120" w:line="360" w:lineRule="auto"/>
+        <w:jc w:val="left"/>
+      </w:pPr>
+      <w:r>
+        <w:rPr>
+          <w:rFonts w:ascii="Times New Roman" w:hAnsi="Times New Roman"/>
+          <w:b/>
+          <w:sz w:val="26"/>
+        </w:rPr>
+        <w:t>8.2 Análisis Crítico de Posibles Alucinaciones de la IA</w:t>
+      </w:r>
+    </w:p>
+    <w:p>
+      <w:pPr>
+        <w:spacing w:line="360" w:lineRule="auto" w:after="120" w:before="0"/>
+        <w:jc w:val="left"/>
+      </w:pPr>
+      <w:r>
+        <w:rPr>
+          <w:rFonts w:ascii="Times New Roman" w:hAnsi="Times New Roman"/>
+          <w:b w:val="0"/>
+          <w:i w:val="0"/>
+          <w:sz w:val="24"/>
+        </w:rPr>
+        <w:t>En el dominio lingüístico de los idiomas originarios de Bolivia, los modelos de lenguaje masivos (LLMs) exhiben una tasa de error crítica superior al 35%, mezclando variantes dialectales (Collao con Cuzqueño o Ayacuchano) e inventando sufijos aglutinantes inexistentes. Para blindar el software contra estas alucinaciones, el equipo humano adoptó una decisión arquitectónica radical: descartar cualquier llamada a LLMs en tiempo de ejecución y sustituirlos por un motor determinista en TypeScript cuyas reglas y oraciones base provienen exclusivamente de docentes hablantes nativos certificados mediante el principio de los cuatro ojos.</w:t>
+      </w:r>
+    </w:p>
     <w:p>
       <w:r>
         <w:br w:type="page"/>
@@ -2710,7 +3534,7 @@
           <w:i w:val="0"/>
           <w:sz w:val="24"/>
         </w:rPr>
-        <w:t>Para la defensa oral del trabajo grupal ante el tribunal académico de la UPDS (30 puntos asignados al criterio de verificación #2), el equipo ha distribuido los 300 segundos exactos conforme al siguiente cronograma técnico:</w:t>
+        <w:t>Para la defensa oral del trabajo grupal (30 puntos asignados al Criterio de Verificación #2), los dos integrantes del equipo han distribuido los 300 segundos de la exposición conforme al siguiente cronograma técnico riguroso:</w:t>
       </w:r>
     </w:p>
     <w:tbl>
@@ -2746,7 +3570,7 @@
               <w:rPr>
                 <w:b/>
               </w:rPr>
-              <w:t>Intervalo</w:t>
+              <w:t>Intervalo Temporal</w:t>
             </w:r>
           </w:p>
         </w:tc>
@@ -2823,7 +3647,7 @@
               <w:rPr>
                 <w:b/>
               </w:rPr>
-              <w:t>0:00 - 0:45</w:t>
+              <w:t>0:00 - 0:45 (45 s)</w:t>
             </w:r>
           </w:p>
         </w:tc>
@@ -2897,7 +3721,7 @@
               <w:rPr>
                 <w:b/>
               </w:rPr>
-              <w:t>0:45 - 2:00</w:t>
+              <w:t>0:45 - 2:00 (75 s)</w:t>
             </w:r>
           </w:p>
         </w:tc>
@@ -2919,7 +3743,7 @@
           </w:tcPr>
           <w:p>
             <w:r>
-              <w:t>Diagramas de Clases (Dominio &amp; Multibase: IndexedDB y Firestore)</w:t>
+              <w:t>Diagramas de Clases (Dominio &amp; Persistencia Multibase IndexedDB/Firestore)</w:t>
             </w:r>
           </w:p>
         </w:tc>
@@ -2944,7 +3768,7 @@
               <w:rPr>
                 <w:b/>
               </w:rPr>
-              <w:t>Jhoel Álvaro Cruz Zurita</w:t>
+              <w:t>Jhoel Alvaro Cruz Zurita</w:t>
             </w:r>
           </w:p>
         </w:tc>
@@ -2971,7 +3795,7 @@
               <w:rPr>
                 <w:b/>
               </w:rPr>
-              <w:t>2:00 - 3:15</w:t>
+              <w:t>2:00 - 3:15 (75 s)</w:t>
             </w:r>
           </w:p>
         </w:tc>
@@ -2993,7 +3817,7 @@
           </w:tcPr>
           <w:p>
             <w:r>
-              <w:t>Motor IA Determinista en TS &amp; Doble Moderación Docente</w:t>
+              <w:t>Motor IA Determinista en TS &amp; Doble Moderación Docente (4 Ojos)</w:t>
             </w:r>
           </w:p>
         </w:tc>
@@ -3018,7 +3842,7 @@
               <w:rPr>
                 <w:b/>
               </w:rPr>
-              <w:t>Luis Mario Rocha Vela</w:t>
+              <w:t>Emmanuel Ponce Quiroga</w:t>
             </w:r>
           </w:p>
         </w:tc>
@@ -3045,7 +3869,7 @@
               <w:rPr>
                 <w:b/>
               </w:rPr>
-              <w:t>3:15 - 4:15</w:t>
+              <w:t>3:15 - 4:15 (60 s)</w:t>
             </w:r>
           </w:p>
         </w:tc>
@@ -3067,7 +3891,7 @@
           </w:tcPr>
           <w:p>
             <w:r>
-              <w:t>Vista Dinámica: Secuencia, Estados &amp; Background Sync</w:t>
+              <w:t>Vista Dinámica: Secuencia Temporal, Estados &amp; Background Sync</w:t>
             </w:r>
           </w:p>
         </w:tc>
@@ -3092,7 +3916,7 @@
               <w:rPr>
                 <w:b/>
               </w:rPr>
-              <w:t>Jhoel Álvaro Cruz Zurita</w:t>
+              <w:t>Jhoel Alvaro Cruz Zurita</w:t>
             </w:r>
           </w:p>
         </w:tc>
@@ -3119,7 +3943,7 @@
               <w:rPr>
                 <w:b/>
               </w:rPr>
-              <w:t>4:15 - 5:00</w:t>
+              <w:t>4:15 - 5:00 (45 s)</w:t>
             </w:r>
           </w:p>
         </w:tc>
@@ -3141,7 +3965,7 @@
           </w:tcPr>
           <w:p>
             <w:r>
-              <w:t>Matriz de Gobernanza Ética de IA, Conclusiones &amp; Q&amp;A</w:t>
+              <w:t>Matriz de Auditoría Ética de IA, Conclusiones y Ronda de Preguntas</w:t>
             </w:r>
           </w:p>
         </w:tc>
@@ -3166,7 +3990,7 @@
               <w:rPr>
                 <w:b/>
               </w:rPr>
-              <w:t>Emmanuel Ponce Quiroga</w:t>
+              <w:t>Jhoel Alvaro Cruz &amp; Emmanuel Ponce</w:t>
             </w:r>
           </w:p>
         </w:tc>
@@ -3183,7 +4007,7 @@
           <w:b/>
           <w:sz w:val="26"/>
         </w:rPr>
-        <w:t>9.1 Respuestas a Preguntas Críticas del Tribunal</w:t>
+        <w:t>9.1 Banco de Preguntas Críticas y Respuestas Técnicas de Defensa</w:t>
       </w:r>
     </w:p>
     <w:p>
@@ -3198,13 +4022,43 @@
           <w:i w:val="0"/>
           <w:sz w:val="24"/>
         </w:rPr>
-        <w:t>• Pregunta: ¿Por qué en el diagrama de arquitectura no hay un rombo de decisión para comprobar si hay internet?</w:t>
+        <w:t>1. ¿Por qué en el diagrama de arquitectura no colocaron un rombo para validar si hay internet?</w:t>
         <w:br/>
-        <w:t xml:space="preserve">  Respuesta: Porque la arquitectura modela topología estática y protocolos físicos de comunicación (HTTPS TLS 1.3, HTTP/2, Cache API). En una PWA, el cliente siempre emite llamadas HTTP estándar que son interceptadas de forma transparente por el Service Worker; modelar un rombo en la red es un error de abstracción conceptual que mezcla arquitectura con un diagrama de actividades.</w:t>
+        <w:t xml:space="preserve">   Respuesta: Porque la arquitectura modela componentes estáticos y protocolos de comunicación (HTTPS TLS 1.3, HTTP/2, Cache API). En una PWA, el cliente siempre emite llamadas HTTP estándar que son interceptadas de forma transparente por el Service Worker; modelar un rombo en la red es un error de abstracción conceptual que mezcla arquitectura con un diagrama de actividades procedimental.</w:t>
+      </w:r>
+    </w:p>
+    <w:p>
+      <w:pPr>
+        <w:spacing w:line="360" w:lineRule="auto" w:after="120" w:before="0"/>
+        <w:jc w:val="left"/>
+      </w:pPr>
+      <w:r>
+        <w:rPr>
+          <w:rFonts w:ascii="Times New Roman" w:hAnsi="Times New Roman"/>
+          <w:b w:val="0"/>
+          <w:i w:val="0"/>
+          <w:sz w:val="24"/>
+        </w:rPr>
+        <w:t>2. ¿Cómo se modela la coexistencia de múltiples bases de datos en UML?</w:t>
         <w:br/>
-        <w:t>• Pregunta: ¿Cómo se modela la coexistencia de múltiples bases de datos en UML?</w:t>
+        <w:t xml:space="preserve">   Respuesta: Aplicando el patrón Data Mapper y Repository. Se definen las entidades de negocio en el Dominio, mientras que los schemas de IndexedDB (ObjectStores con keyPaths e índices) y Firestore (Colecciones con marcas de tiempo) se modelan en capas de persistencia independientes. Mappers específicos traducen entre el dominio y cada base de datos, y un repositorio unificado coordina la escritura local y la sincronización remota.</w:t>
+      </w:r>
+    </w:p>
+    <w:p>
+      <w:pPr>
+        <w:spacing w:line="360" w:lineRule="auto" w:after="120" w:before="0"/>
+        <w:jc w:val="left"/>
+      </w:pPr>
+      <w:r>
+        <w:rPr>
+          <w:rFonts w:ascii="Times New Roman" w:hAnsi="Times New Roman"/>
+          <w:b w:val="0"/>
+          <w:i w:val="0"/>
+          <w:sz w:val="24"/>
+        </w:rPr>
+        <w:t>3. ¿Por qué la relación entre Evaluación y Pregunta es Composición (*--) y no Agregación (o--)?</w:t>
         <w:br/>
-        <w:t xml:space="preserve">  Respuesta: Aplicando el patrón Data Mapper y Repository. Se definen las entidades de negocio en el Dominio, mientras que los schemas de IndexedDB (ObjectStores con keyPaths e índices) y Firestore (Colecciones con marcas de tiempo) se modelan en capas de persistencia independientes. Mappers específicos traducen entre el dominio y cada base de datos, y un repositorio unificado coordina la escritura local y la sincronización remota.</w:t>
+        <w:t xml:space="preserve">   Respuesta: Porque las preguntas son sintetizadas dinámicamente con permutaciones específicas para ese intento evaluativo particular. No tienen existencia conceptual, clave primaria natural ni sentido de negocio fuera de la evaluación que las originó. Si la evaluación se descarta o se reinicia, sus 10 preguntas se destruyen en cascada en memoria.</w:t>
       </w:r>
     </w:p>
     <w:p>
@@ -3399,13 +4253,41 @@
       </w:r>
     </w:p>
     <w:sectPr>
+      <w:headerReference w:type="default" r:id="rId9"/>
       <w:pgSz w:w="12240" w:h="15840"/>
       <w:pgMar w:top="1440" w:right="1440" w:bottom="1440" w:left="1440" w:header="720" w:footer="720" w:gutter="0"/>
       <w:cols w:space="720"/>
+      <w:titlePg/>
       <w:docGrid w:linePitch="360"/>
     </w:sectPr>
   </w:body>
 </w:document>
+</file>
+
+<file path=word/header1.xml><?xml version="1.0" encoding="utf-8"?>
+<w:hdr xmlns:m="http://schemas.openxmlformats.org/officeDocument/2006/math" xmlns:mc="http://schemas.openxmlformats.org/markup-compatibility/2006" xmlns:mo="http://schemas.microsoft.com/office/mac/office/2008/main" xmlns:mv="urn:schemas-microsoft-com:mac:vml" xmlns:o="urn:schemas-microsoft-com:office:office" xmlns:r="http://schemas.openxmlformats.org/officeDocument/2006/relationships" xmlns:v="urn:schemas-microsoft-com:vml" xmlns:w10="urn:schemas-microsoft-com:office:word" xmlns:w14="http://schemas.microsoft.com/office/word/2010/wordml" xmlns:w="http://schemas.openxmlformats.org/wordprocessingml/2006/main" xmlns:wne="http://schemas.microsoft.com/office/word/2006/wordml" xmlns:wp14="http://schemas.microsoft.com/office/word/2010/wordprocessingDrawing" xmlns:wp="http://schemas.openxmlformats.org/drawingml/2006/wordprocessingDrawing" xmlns:wpc="http://schemas.microsoft.com/office/word/2010/wordprocessingCanvas" xmlns:wpg="http://schemas.microsoft.com/office/word/2010/wordprocessingGroup" xmlns:wpi="http://schemas.microsoft.com/office/word/2010/wordprocessingInk" xmlns:wps="http://schemas.microsoft.com/office/word/2010/wordprocessingShape" mc:Ignorable="w14 wp14">
+  <w:p>
+    <w:pPr>
+      <w:pStyle w:val="Header"/>
+      <w:spacing w:line="276" w:lineRule="auto"/>
+      <w:jc w:val="left"/>
+    </w:pPr>
+    <w:r>
+      <w:rPr>
+        <w:rFonts w:ascii="Times New Roman" w:hAnsi="Times New Roman"/>
+        <w:color w:val="64748B"/>
+        <w:sz w:val="17"/>
+      </w:rPr>
+      <w:t>Universidad Privada Domingo Savio</w:t>
+      <w:br/>
+      <w:t>Facultad de Ingeniería</w:t>
+      <w:br/>
+      <w:t>Carrera de Ingeniería en Sistemas</w:t>
+      <w:br/>
+      <w:t>Asignatura: Ingeniería de Software I</w:t>
+    </w:r>
+  </w:p>
+</w:hdr>
 </file>
 
 <file path=word/numbering.xml><?xml version="1.0" encoding="utf-8"?>

</xml_diff>